<commit_message>
Merge origin/master: integrate remote paper updates with local Stage 2.5 revisions
</commit_message>
<xml_diff>
--- a/docs/course_report/基于统一SDC矩阵的仅测角EKF-SDRE航天器相对导航与控制研究.docx
+++ b/docs/course_report/基于统一SDC矩阵的仅测角EKF-SDRE航天器相对导航与控制研究.docx
@@ -973,9 +973,73 @@
       <w:r>
         <w:t xml:space="preserve"> </w:t>
       </w:r>
-      <w:r>
-        <w:t xml:space="preserve">$f(x)=A_{\rm SDC}(x)x$</w:t>
-      </w:r>
+      <m:oMath>
+        <m:r>
+          <m:t>f</m:t>
+        </m:r>
+        <m:d>
+          <m:dPr>
+            <m:begChr m:val="("/>
+            <m:endChr m:val=")"/>
+            <m:sepChr m:val=""/>
+            <m:grow/>
+          </m:dPr>
+          <m:e>
+            <m:r>
+              <m:t>x</m:t>
+            </m:r>
+          </m:e>
+        </m:d>
+        <m:r>
+          <m:rPr>
+            <m:sty m:val="p"/>
+          </m:rPr>
+          <m:t>=</m:t>
+        </m:r>
+        <m:sSub>
+          <m:e>
+            <m:r>
+              <m:t>A</m:t>
+            </m:r>
+          </m:e>
+          <m:sub>
+            <m:r>
+              <m:rPr>
+                <m:sty m:val="p"/>
+              </m:rPr>
+              <m:t>S</m:t>
+            </m:r>
+            <m:r>
+              <m:rPr>
+                <m:sty m:val="p"/>
+              </m:rPr>
+              <m:t>D</m:t>
+            </m:r>
+            <m:r>
+              <m:rPr>
+                <m:sty m:val="p"/>
+              </m:rPr>
+              <m:t>C</m:t>
+            </m:r>
+          </m:sub>
+        </m:sSub>
+        <m:d>
+          <m:dPr>
+            <m:begChr m:val="("/>
+            <m:endChr m:val=")"/>
+            <m:sepChr m:val=""/>
+            <m:grow/>
+          </m:dPr>
+          <m:e>
+            <m:r>
+              <m:t>x</m:t>
+            </m:r>
+          </m:e>
+        </m:d>
+        <m:r>
+          <m:t>x</m:t>
+        </m:r>
+      </m:oMath>
       <w:r>
         <w:rPr>
           <w:rFonts w:hint="eastAsia"/>
@@ -1036,9 +1100,73 @@
       <w:r>
         <w:t xml:space="preserve"> </w:t>
       </w:r>
-      <w:r>
-        <w:t xml:space="preserve">$A_{\rm SDC}(\hat{x}_{k|k})$</w:t>
-      </w:r>
+      <m:oMath>
+        <m:sSub>
+          <m:e>
+            <m:r>
+              <m:t>A</m:t>
+            </m:r>
+          </m:e>
+          <m:sub>
+            <m:r>
+              <m:rPr>
+                <m:sty m:val="p"/>
+              </m:rPr>
+              <m:t>S</m:t>
+            </m:r>
+            <m:r>
+              <m:rPr>
+                <m:sty m:val="p"/>
+              </m:rPr>
+              <m:t>D</m:t>
+            </m:r>
+            <m:r>
+              <m:rPr>
+                <m:sty m:val="p"/>
+              </m:rPr>
+              <m:t>C</m:t>
+            </m:r>
+          </m:sub>
+        </m:sSub>
+        <m:d>
+          <m:dPr>
+            <m:begChr m:val="("/>
+            <m:endChr m:val=")"/>
+            <m:sepChr m:val=""/>
+            <m:grow/>
+          </m:dPr>
+          <m:e>
+            <m:sSub>
+              <m:e>
+                <m:acc>
+                  <m:accPr>
+                    <m:chr m:val="̂"/>
+                  </m:accPr>
+                  <m:e>
+                    <m:r>
+                      <m:t>x</m:t>
+                    </m:r>
+                  </m:e>
+                </m:acc>
+              </m:e>
+              <m:sub>
+                <m:r>
+                  <m:t>k</m:t>
+                </m:r>
+                <m:r>
+                  <m:rPr>
+                    <m:sty m:val="p"/>
+                  </m:rPr>
+                  <m:t>|</m:t>
+                </m:r>
+                <m:r>
+                  <m:t>k</m:t>
+                </m:r>
+              </m:sub>
+            </m:sSub>
+          </m:e>
+        </m:d>
+      </m:oMath>
       <w:r>
         <w:rPr>
           <w:rFonts w:hint="eastAsia"/>
@@ -1057,9 +1185,68 @@
       <w:r>
         <w:t xml:space="preserve"> </w:t>
       </w:r>
-      <w:r>
-        <w:t xml:space="preserve">$F_k=I+A_{\rm SDC}\Delta t$</w:t>
-      </w:r>
+      <m:oMath>
+        <m:sSub>
+          <m:e>
+            <m:r>
+              <m:t>F</m:t>
+            </m:r>
+          </m:e>
+          <m:sub>
+            <m:r>
+              <m:t>k</m:t>
+            </m:r>
+          </m:sub>
+        </m:sSub>
+        <m:r>
+          <m:rPr>
+            <m:sty m:val="p"/>
+          </m:rPr>
+          <m:t>=</m:t>
+        </m:r>
+        <m:r>
+          <m:t>I</m:t>
+        </m:r>
+        <m:r>
+          <m:rPr>
+            <m:sty m:val="p"/>
+          </m:rPr>
+          <m:t>+</m:t>
+        </m:r>
+        <m:sSub>
+          <m:e>
+            <m:r>
+              <m:t>A</m:t>
+            </m:r>
+          </m:e>
+          <m:sub>
+            <m:r>
+              <m:rPr>
+                <m:sty m:val="p"/>
+              </m:rPr>
+              <m:t>S</m:t>
+            </m:r>
+            <m:r>
+              <m:rPr>
+                <m:sty m:val="p"/>
+              </m:rPr>
+              <m:t>D</m:t>
+            </m:r>
+            <m:r>
+              <m:rPr>
+                <m:sty m:val="p"/>
+              </m:rPr>
+              <m:t>C</m:t>
+            </m:r>
+          </m:sub>
+        </m:sSub>
+        <m:r>
+          <m:t>Δ</m:t>
+        </m:r>
+        <m:r>
+          <m:t>t</m:t>
+        </m:r>
+      </m:oMath>
       <w:r>
         <w:t xml:space="preserve"> </w:t>
       </w:r>
@@ -1339,9 +1526,35 @@
       <w:r>
         <w:t xml:space="preserve"> </w:t>
       </w:r>
-      <w:r>
-        <w:t xml:space="preserve">$A_{\rm SDC}$</w:t>
-      </w:r>
+      <m:oMath>
+        <m:sSub>
+          <m:e>
+            <m:r>
+              <m:t>A</m:t>
+            </m:r>
+          </m:e>
+          <m:sub>
+            <m:r>
+              <m:rPr>
+                <m:sty m:val="p"/>
+              </m:rPr>
+              <m:t>S</m:t>
+            </m:r>
+            <m:r>
+              <m:rPr>
+                <m:sty m:val="p"/>
+              </m:rPr>
+              <m:t>D</m:t>
+            </m:r>
+            <m:r>
+              <m:rPr>
+                <m:sty m:val="p"/>
+              </m:rPr>
+              <m:t>C</m:t>
+            </m:r>
+          </m:sub>
+        </m:sSub>
+      </m:oMath>
       <w:r>
         <w:rPr>
           <w:rFonts w:hint="eastAsia"/>
@@ -1497,9 +1710,71 @@
       <w:r>
         <w:t xml:space="preserve"> </w:t>
       </w:r>
-      <w:r>
-        <w:t xml:space="preserve">$x_{\rm rel}=X_p-X_e$</w:t>
-      </w:r>
+      <m:oMath>
+        <m:sSub>
+          <m:e>
+            <m:r>
+              <m:t>x</m:t>
+            </m:r>
+          </m:e>
+          <m:sub>
+            <m:r>
+              <m:rPr>
+                <m:sty m:val="p"/>
+              </m:rPr>
+              <m:t>r</m:t>
+            </m:r>
+            <m:r>
+              <m:rPr>
+                <m:sty m:val="p"/>
+              </m:rPr>
+              <m:t>e</m:t>
+            </m:r>
+            <m:r>
+              <m:rPr>
+                <m:sty m:val="p"/>
+              </m:rPr>
+              <m:t>l</m:t>
+            </m:r>
+          </m:sub>
+        </m:sSub>
+        <m:r>
+          <m:rPr>
+            <m:sty m:val="p"/>
+          </m:rPr>
+          <m:t>=</m:t>
+        </m:r>
+        <m:sSub>
+          <m:e>
+            <m:r>
+              <m:t>X</m:t>
+            </m:r>
+          </m:e>
+          <m:sub>
+            <m:r>
+              <m:t>p</m:t>
+            </m:r>
+          </m:sub>
+        </m:sSub>
+        <m:r>
+          <m:rPr>
+            <m:sty m:val="p"/>
+          </m:rPr>
+          <m:t>−</m:t>
+        </m:r>
+        <m:sSub>
+          <m:e>
+            <m:r>
+              <m:t>X</m:t>
+            </m:r>
+          </m:e>
+          <m:sub>
+            <m:r>
+              <m:t>e</m:t>
+            </m:r>
+          </m:sub>
+        </m:sSub>
+      </m:oMath>
       <w:r>
         <w:rPr>
           <w:rFonts w:hint="eastAsia"/>
@@ -2963,11 +3238,165 @@
       <w:pPr>
         <w:pStyle w:val="BodyText"/>
       </w:pPr>
-      <w:r>
-        <w:t xml:space="preserve">$$
-    x_{\rm rel}=X_p-X_e=[\Delta r^T,\Delta v^T]^T\in\mathbb{R}^6.
-    $$</w:t>
-      </w:r>
+      <m:oMathPara>
+        <m:oMathParaPr>
+          <m:jc m:val="center"/>
+        </m:oMathParaPr>
+        <m:oMath>
+          <m:sSub>
+            <m:e>
+              <m:r>
+                <m:t>x</m:t>
+              </m:r>
+            </m:e>
+            <m:sub>
+              <m:r>
+                <m:rPr>
+                  <m:sty m:val="p"/>
+                </m:rPr>
+                <m:t>r</m:t>
+              </m:r>
+              <m:r>
+                <m:rPr>
+                  <m:sty m:val="p"/>
+                </m:rPr>
+                <m:t>e</m:t>
+              </m:r>
+              <m:r>
+                <m:rPr>
+                  <m:sty m:val="p"/>
+                </m:rPr>
+                <m:t>l</m:t>
+              </m:r>
+            </m:sub>
+          </m:sSub>
+          <m:r>
+            <m:rPr>
+              <m:sty m:val="p"/>
+            </m:rPr>
+            <m:t>=</m:t>
+          </m:r>
+          <m:sSub>
+            <m:e>
+              <m:r>
+                <m:t>X</m:t>
+              </m:r>
+            </m:e>
+            <m:sub>
+              <m:r>
+                <m:t>p</m:t>
+              </m:r>
+            </m:sub>
+          </m:sSub>
+          <m:r>
+            <m:rPr>
+              <m:sty m:val="p"/>
+            </m:rPr>
+            <m:t>−</m:t>
+          </m:r>
+          <m:sSub>
+            <m:e>
+              <m:r>
+                <m:t>X</m:t>
+              </m:r>
+            </m:e>
+            <m:sub>
+              <m:r>
+                <m:t>e</m:t>
+              </m:r>
+            </m:sub>
+          </m:sSub>
+          <m:r>
+            <m:rPr>
+              <m:sty m:val="p"/>
+            </m:rPr>
+            <m:t>=</m:t>
+          </m:r>
+          <m:sSup>
+            <m:e>
+              <m:d>
+                <m:dPr>
+                  <m:begChr m:val="["/>
+                  <m:endChr m:val="]"/>
+                  <m:sepChr m:val=""/>
+                  <m:grow/>
+                </m:dPr>
+                <m:e>
+                  <m:r>
+                    <m:t>Δ</m:t>
+                  </m:r>
+                  <m:sSup>
+                    <m:e>
+                      <m:r>
+                        <m:t>r</m:t>
+                      </m:r>
+                    </m:e>
+                    <m:sup>
+                      <m:r>
+                        <m:t>T</m:t>
+                      </m:r>
+                    </m:sup>
+                  </m:sSup>
+                  <m:r>
+                    <m:rPr>
+                      <m:sty m:val="p"/>
+                    </m:rPr>
+                    <m:t>,</m:t>
+                  </m:r>
+                  <m:r>
+                    <m:t>Δ</m:t>
+                  </m:r>
+                  <m:sSup>
+                    <m:e>
+                      <m:r>
+                        <m:t>v</m:t>
+                      </m:r>
+                    </m:e>
+                    <m:sup>
+                      <m:r>
+                        <m:t>T</m:t>
+                      </m:r>
+                    </m:sup>
+                  </m:sSup>
+                </m:e>
+              </m:d>
+            </m:e>
+            <m:sup>
+              <m:r>
+                <m:t>T</m:t>
+              </m:r>
+            </m:sup>
+          </m:sSup>
+          <m:r>
+            <m:rPr>
+              <m:sty m:val="p"/>
+            </m:rPr>
+            <m:t>∈</m:t>
+          </m:r>
+          <m:sSup>
+            <m:e>
+              <m:r>
+                <m:rPr>
+                  <m:sty m:val="p"/>
+                  <m:scr m:val="double-struck"/>
+                </m:rPr>
+                <m:t>R</m:t>
+              </m:r>
+            </m:e>
+            <m:sup>
+              <m:r>
+                <m:t>6</m:t>
+              </m:r>
+            </m:sup>
+          </m:sSup>
+          <m:r>
+            <m:rPr>
+              <m:sty m:val="p"/>
+            </m:rPr>
+            <m:t>.</m:t>
+          </m:r>
+        </m:oMath>
+      </m:oMathPara>
     </w:p>
     <w:p>
       <w:pPr>
@@ -3284,11 +3713,144 @@
       <w:pPr>
         <w:pStyle w:val="BodyText"/>
       </w:pPr>
-      <w:r>
-        <w:t xml:space="preserve">$$
-    \dot{x}_{\rm rel}=f(x_{\rm rel},\nu,u_p,u_e).
-    $$</w:t>
-      </w:r>
+      <m:oMathPara>
+        <m:oMathParaPr>
+          <m:jc m:val="center"/>
+        </m:oMathParaPr>
+        <m:oMath>
+          <m:sSub>
+            <m:e>
+              <m:acc>
+                <m:accPr>
+                  <m:chr m:val="̇"/>
+                </m:accPr>
+                <m:e>
+                  <m:r>
+                    <m:t>x</m:t>
+                  </m:r>
+                </m:e>
+              </m:acc>
+            </m:e>
+            <m:sub>
+              <m:r>
+                <m:rPr>
+                  <m:sty m:val="p"/>
+                </m:rPr>
+                <m:t>r</m:t>
+              </m:r>
+              <m:r>
+                <m:rPr>
+                  <m:sty m:val="p"/>
+                </m:rPr>
+                <m:t>e</m:t>
+              </m:r>
+              <m:r>
+                <m:rPr>
+                  <m:sty m:val="p"/>
+                </m:rPr>
+                <m:t>l</m:t>
+              </m:r>
+            </m:sub>
+          </m:sSub>
+          <m:r>
+            <m:rPr>
+              <m:sty m:val="p"/>
+            </m:rPr>
+            <m:t>=</m:t>
+          </m:r>
+          <m:r>
+            <m:t>f</m:t>
+          </m:r>
+          <m:d>
+            <m:dPr>
+              <m:begChr m:val="("/>
+              <m:endChr m:val=")"/>
+              <m:sepChr m:val=""/>
+              <m:grow/>
+            </m:dPr>
+            <m:e>
+              <m:sSub>
+                <m:e>
+                  <m:r>
+                    <m:t>x</m:t>
+                  </m:r>
+                </m:e>
+                <m:sub>
+                  <m:r>
+                    <m:rPr>
+                      <m:sty m:val="p"/>
+                    </m:rPr>
+                    <m:t>r</m:t>
+                  </m:r>
+                  <m:r>
+                    <m:rPr>
+                      <m:sty m:val="p"/>
+                    </m:rPr>
+                    <m:t>e</m:t>
+                  </m:r>
+                  <m:r>
+                    <m:rPr>
+                      <m:sty m:val="p"/>
+                    </m:rPr>
+                    <m:t>l</m:t>
+                  </m:r>
+                </m:sub>
+              </m:sSub>
+              <m:r>
+                <m:rPr>
+                  <m:sty m:val="p"/>
+                </m:rPr>
+                <m:t>,</m:t>
+              </m:r>
+              <m:r>
+                <m:t>ν</m:t>
+              </m:r>
+              <m:r>
+                <m:rPr>
+                  <m:sty m:val="p"/>
+                </m:rPr>
+                <m:t>,</m:t>
+              </m:r>
+              <m:sSub>
+                <m:e>
+                  <m:r>
+                    <m:t>u</m:t>
+                  </m:r>
+                </m:e>
+                <m:sub>
+                  <m:r>
+                    <m:t>p</m:t>
+                  </m:r>
+                </m:sub>
+              </m:sSub>
+              <m:r>
+                <m:rPr>
+                  <m:sty m:val="p"/>
+                </m:rPr>
+                <m:t>,</m:t>
+              </m:r>
+              <m:sSub>
+                <m:e>
+                  <m:r>
+                    <m:t>u</m:t>
+                  </m:r>
+                </m:e>
+                <m:sub>
+                  <m:r>
+                    <m:t>e</m:t>
+                  </m:r>
+                </m:sub>
+              </m:sSub>
+            </m:e>
+          </m:d>
+          <m:r>
+            <m:rPr>
+              <m:sty m:val="p"/>
+            </m:rPr>
+            <m:t>.</m:t>
+          </m:r>
+        </m:oMath>
+      </m:oMathPara>
     </w:p>
     <w:p>
       <w:pPr>
@@ -3326,7 +3888,7 @@
       <w:r>
         <w:drawing>
           <wp:inline>
-            <wp:extent cx="4536241" cy="4224630"/>
+            <wp:extent cx="4587240" cy="3425406"/>
             <wp:effectExtent b="0" l="0" r="0" t="0"/>
             <wp:docPr descr="图1 LVLH 坐标系与相对运动几何示意" title="" id="29" name="Picture"/>
             <a:graphic>
@@ -3347,7 +3909,7 @@
                   <pic:spPr bwMode="auto">
                     <a:xfrm>
                       <a:off x="0" y="0"/>
-                      <a:ext cx="4536241" cy="4224630"/>
+                      <a:ext cx="4587240" cy="3425406"/>
                     </a:xfrm>
                     <a:prstGeom prst="rect">
                       <a:avLst/>
@@ -3505,11 +4067,208 @@
       <w:pPr>
         <w:pStyle w:val="BodyText"/>
       </w:pPr>
-      <w:r>
-        <w:t xml:space="preserve">$$
-    \dot{x}_{\rm rel}=A_{\rm SDC}(x_{\rm rel},\nu)x_{\rm rel}+B(u_p-u_e),
-    $$</w:t>
-      </w:r>
+      <m:oMathPara>
+        <m:oMathParaPr>
+          <m:jc m:val="center"/>
+        </m:oMathParaPr>
+        <m:oMath>
+          <m:sSub>
+            <m:e>
+              <m:acc>
+                <m:accPr>
+                  <m:chr m:val="̇"/>
+                </m:accPr>
+                <m:e>
+                  <m:r>
+                    <m:t>x</m:t>
+                  </m:r>
+                </m:e>
+              </m:acc>
+            </m:e>
+            <m:sub>
+              <m:r>
+                <m:rPr>
+                  <m:sty m:val="p"/>
+                </m:rPr>
+                <m:t>r</m:t>
+              </m:r>
+              <m:r>
+                <m:rPr>
+                  <m:sty m:val="p"/>
+                </m:rPr>
+                <m:t>e</m:t>
+              </m:r>
+              <m:r>
+                <m:rPr>
+                  <m:sty m:val="p"/>
+                </m:rPr>
+                <m:t>l</m:t>
+              </m:r>
+            </m:sub>
+          </m:sSub>
+          <m:r>
+            <m:rPr>
+              <m:sty m:val="p"/>
+            </m:rPr>
+            <m:t>=</m:t>
+          </m:r>
+          <m:sSub>
+            <m:e>
+              <m:r>
+                <m:t>A</m:t>
+              </m:r>
+            </m:e>
+            <m:sub>
+              <m:r>
+                <m:rPr>
+                  <m:sty m:val="p"/>
+                </m:rPr>
+                <m:t>S</m:t>
+              </m:r>
+              <m:r>
+                <m:rPr>
+                  <m:sty m:val="p"/>
+                </m:rPr>
+                <m:t>D</m:t>
+              </m:r>
+              <m:r>
+                <m:rPr>
+                  <m:sty m:val="p"/>
+                </m:rPr>
+                <m:t>C</m:t>
+              </m:r>
+            </m:sub>
+          </m:sSub>
+          <m:d>
+            <m:dPr>
+              <m:begChr m:val="("/>
+              <m:endChr m:val=")"/>
+              <m:sepChr m:val=""/>
+              <m:grow/>
+            </m:dPr>
+            <m:e>
+              <m:sSub>
+                <m:e>
+                  <m:r>
+                    <m:t>x</m:t>
+                  </m:r>
+                </m:e>
+                <m:sub>
+                  <m:r>
+                    <m:rPr>
+                      <m:sty m:val="p"/>
+                    </m:rPr>
+                    <m:t>r</m:t>
+                  </m:r>
+                  <m:r>
+                    <m:rPr>
+                      <m:sty m:val="p"/>
+                    </m:rPr>
+                    <m:t>e</m:t>
+                  </m:r>
+                  <m:r>
+                    <m:rPr>
+                      <m:sty m:val="p"/>
+                    </m:rPr>
+                    <m:t>l</m:t>
+                  </m:r>
+                </m:sub>
+              </m:sSub>
+              <m:r>
+                <m:rPr>
+                  <m:sty m:val="p"/>
+                </m:rPr>
+                <m:t>,</m:t>
+              </m:r>
+              <m:r>
+                <m:t>ν</m:t>
+              </m:r>
+            </m:e>
+          </m:d>
+          <m:sSub>
+            <m:e>
+              <m:r>
+                <m:t>x</m:t>
+              </m:r>
+            </m:e>
+            <m:sub>
+              <m:r>
+                <m:rPr>
+                  <m:sty m:val="p"/>
+                </m:rPr>
+                <m:t>r</m:t>
+              </m:r>
+              <m:r>
+                <m:rPr>
+                  <m:sty m:val="p"/>
+                </m:rPr>
+                <m:t>e</m:t>
+              </m:r>
+              <m:r>
+                <m:rPr>
+                  <m:sty m:val="p"/>
+                </m:rPr>
+                <m:t>l</m:t>
+              </m:r>
+            </m:sub>
+          </m:sSub>
+          <m:r>
+            <m:rPr>
+              <m:sty m:val="p"/>
+            </m:rPr>
+            <m:t>+</m:t>
+          </m:r>
+          <m:r>
+            <m:t>B</m:t>
+          </m:r>
+          <m:d>
+            <m:dPr>
+              <m:begChr m:val="("/>
+              <m:endChr m:val=")"/>
+              <m:sepChr m:val=""/>
+              <m:grow/>
+            </m:dPr>
+            <m:e>
+              <m:sSub>
+                <m:e>
+                  <m:r>
+                    <m:t>u</m:t>
+                  </m:r>
+                </m:e>
+                <m:sub>
+                  <m:r>
+                    <m:t>p</m:t>
+                  </m:r>
+                </m:sub>
+              </m:sSub>
+              <m:r>
+                <m:rPr>
+                  <m:sty m:val="p"/>
+                </m:rPr>
+                <m:t>−</m:t>
+              </m:r>
+              <m:sSub>
+                <m:e>
+                  <m:r>
+                    <m:t>u</m:t>
+                  </m:r>
+                </m:e>
+                <m:sub>
+                  <m:r>
+                    <m:t>e</m:t>
+                  </m:r>
+                </m:sub>
+              </m:sSub>
+            </m:e>
+          </m:d>
+          <m:r>
+            <m:rPr>
+              <m:sty m:val="p"/>
+            </m:rPr>
+            <m:t>,</m:t>
+          </m:r>
+        </m:oMath>
+      </m:oMathPara>
     </w:p>
     <w:p>
       <w:pPr>
@@ -3627,9 +4386,35 @@
       <w:r>
         <w:t xml:space="preserve"> </w:t>
       </w:r>
-      <w:r>
-        <w:t xml:space="preserve">$A_{\rm SDC}$</w:t>
-      </w:r>
+      <m:oMath>
+        <m:sSub>
+          <m:e>
+            <m:r>
+              <m:t>A</m:t>
+            </m:r>
+          </m:e>
+          <m:sub>
+            <m:r>
+              <m:rPr>
+                <m:sty m:val="p"/>
+              </m:rPr>
+              <m:t>S</m:t>
+            </m:r>
+            <m:r>
+              <m:rPr>
+                <m:sty m:val="p"/>
+              </m:rPr>
+              <m:t>D</m:t>
+            </m:r>
+            <m:r>
+              <m:rPr>
+                <m:sty m:val="p"/>
+              </m:rPr>
+              <m:t>C</m:t>
+            </m:r>
+          </m:sub>
+        </m:sSub>
+      </m:oMath>
       <w:r>
         <w:t xml:space="preserve"> </w:t>
       </w:r>
@@ -3644,15 +4429,210 @@
       <w:pPr>
         <w:pStyle w:val="BodyText"/>
       </w:pPr>
-      <w:r>
-        <w:t xml:space="preserve">$$
-    A_{\rm SDC}=
-    \begin{bmatrix}
-    0_{3\times3} &amp; I_3\\
-    A_{21}(x_{\rm rel},\nu) &amp; A_{22}(\nu)
-    \end{bmatrix}.
-    $$</w:t>
-      </w:r>
+      <m:oMathPara>
+        <m:oMathParaPr>
+          <m:jc m:val="center"/>
+        </m:oMathParaPr>
+        <m:oMath>
+          <m:sSub>
+            <m:e>
+              <m:r>
+                <m:t>A</m:t>
+              </m:r>
+            </m:e>
+            <m:sub>
+              <m:r>
+                <m:rPr>
+                  <m:sty m:val="p"/>
+                </m:rPr>
+                <m:t>S</m:t>
+              </m:r>
+              <m:r>
+                <m:rPr>
+                  <m:sty m:val="p"/>
+                </m:rPr>
+                <m:t>D</m:t>
+              </m:r>
+              <m:r>
+                <m:rPr>
+                  <m:sty m:val="p"/>
+                </m:rPr>
+                <m:t>C</m:t>
+              </m:r>
+            </m:sub>
+          </m:sSub>
+          <m:r>
+            <m:rPr>
+              <m:sty m:val="p"/>
+            </m:rPr>
+            <m:t>=</m:t>
+          </m:r>
+          <m:d>
+            <m:dPr>
+              <m:begChr m:val="["/>
+              <m:endChr m:val="]"/>
+              <m:sepChr m:val=""/>
+              <m:grow/>
+            </m:dPr>
+            <m:e>
+              <m:m>
+                <m:mPr>
+                  <m:baseJc m:val="center"/>
+                  <m:plcHide m:val="on"/>
+                  <m:mcs>
+                    <m:mc>
+                      <m:mcPr>
+                        <m:mcJc m:val="center"/>
+                        <m:count m:val="1"/>
+                      </m:mcPr>
+                    </m:mc>
+                    <m:mc>
+                      <m:mcPr>
+                        <m:mcJc m:val="center"/>
+                        <m:count m:val="1"/>
+                      </m:mcPr>
+                    </m:mc>
+                  </m:mcs>
+                </m:mPr>
+                <m:mr>
+                  <m:e>
+                    <m:sSub>
+                      <m:e>
+                        <m:r>
+                          <m:t>0</m:t>
+                        </m:r>
+                      </m:e>
+                      <m:sub>
+                        <m:r>
+                          <m:t>3</m:t>
+                        </m:r>
+                        <m:r>
+                          <m:rPr>
+                            <m:sty m:val="p"/>
+                          </m:rPr>
+                          <m:t>×</m:t>
+                        </m:r>
+                        <m:r>
+                          <m:t>3</m:t>
+                        </m:r>
+                      </m:sub>
+                    </m:sSub>
+                  </m:e>
+                  <m:e>
+                    <m:sSub>
+                      <m:e>
+                        <m:r>
+                          <m:t>I</m:t>
+                        </m:r>
+                      </m:e>
+                      <m:sub>
+                        <m:r>
+                          <m:t>3</m:t>
+                        </m:r>
+                      </m:sub>
+                    </m:sSub>
+                  </m:e>
+                </m:mr>
+                <m:mr>
+                  <m:e>
+                    <m:sSub>
+                      <m:e>
+                        <m:r>
+                          <m:t>A</m:t>
+                        </m:r>
+                      </m:e>
+                      <m:sub>
+                        <m:r>
+                          <m:t>21</m:t>
+                        </m:r>
+                      </m:sub>
+                    </m:sSub>
+                    <m:d>
+                      <m:dPr>
+                        <m:begChr m:val="("/>
+                        <m:endChr m:val=")"/>
+                        <m:sepChr m:val=""/>
+                        <m:grow/>
+                      </m:dPr>
+                      <m:e>
+                        <m:sSub>
+                          <m:e>
+                            <m:r>
+                              <m:t>x</m:t>
+                            </m:r>
+                          </m:e>
+                          <m:sub>
+                            <m:r>
+                              <m:rPr>
+                                <m:sty m:val="p"/>
+                              </m:rPr>
+                              <m:t>r</m:t>
+                            </m:r>
+                            <m:r>
+                              <m:rPr>
+                                <m:sty m:val="p"/>
+                              </m:rPr>
+                              <m:t>e</m:t>
+                            </m:r>
+                            <m:r>
+                              <m:rPr>
+                                <m:sty m:val="p"/>
+                              </m:rPr>
+                              <m:t>l</m:t>
+                            </m:r>
+                          </m:sub>
+                        </m:sSub>
+                        <m:r>
+                          <m:rPr>
+                            <m:sty m:val="p"/>
+                          </m:rPr>
+                          <m:t>,</m:t>
+                        </m:r>
+                        <m:r>
+                          <m:t>ν</m:t>
+                        </m:r>
+                      </m:e>
+                    </m:d>
+                  </m:e>
+                  <m:e>
+                    <m:sSub>
+                      <m:e>
+                        <m:r>
+                          <m:t>A</m:t>
+                        </m:r>
+                      </m:e>
+                      <m:sub>
+                        <m:r>
+                          <m:t>22</m:t>
+                        </m:r>
+                      </m:sub>
+                    </m:sSub>
+                    <m:d>
+                      <m:dPr>
+                        <m:begChr m:val="("/>
+                        <m:endChr m:val=")"/>
+                        <m:sepChr m:val=""/>
+                        <m:grow/>
+                      </m:dPr>
+                      <m:e>
+                        <m:r>
+                          <m:t>ν</m:t>
+                        </m:r>
+                      </m:e>
+                    </m:d>
+                  </m:e>
+                </m:mr>
+              </m:m>
+            </m:e>
+          </m:d>
+          <m:r>
+            <m:rPr>
+              <m:sty m:val="p"/>
+            </m:rPr>
+            <m:t>.</m:t>
+          </m:r>
+        </m:oMath>
+      </m:oMathPara>
     </w:p>
     <w:p>
       <w:pPr>
@@ -3917,9 +4897,57 @@
       <w:r>
         <w:t xml:space="preserve"> </w:t>
       </w:r>
-      <w:r>
-        <w:t xml:space="preserve">$A_{\rm SDC}(t_k)$</w:t>
-      </w:r>
+      <m:oMath>
+        <m:sSub>
+          <m:e>
+            <m:r>
+              <m:t>A</m:t>
+            </m:r>
+          </m:e>
+          <m:sub>
+            <m:r>
+              <m:rPr>
+                <m:sty m:val="p"/>
+              </m:rPr>
+              <m:t>S</m:t>
+            </m:r>
+            <m:r>
+              <m:rPr>
+                <m:sty m:val="p"/>
+              </m:rPr>
+              <m:t>D</m:t>
+            </m:r>
+            <m:r>
+              <m:rPr>
+                <m:sty m:val="p"/>
+              </m:rPr>
+              <m:t>C</m:t>
+            </m:r>
+          </m:sub>
+        </m:sSub>
+        <m:d>
+          <m:dPr>
+            <m:begChr m:val="("/>
+            <m:endChr m:val=")"/>
+            <m:sepChr m:val=""/>
+            <m:grow/>
+          </m:dPr>
+          <m:e>
+            <m:sSub>
+              <m:e>
+                <m:r>
+                  <m:t>t</m:t>
+                </m:r>
+              </m:e>
+              <m:sub>
+                <m:r>
+                  <m:t>k</m:t>
+                </m:r>
+              </m:sub>
+            </m:sSub>
+          </m:e>
+        </m:d>
+      </m:oMath>
       <w:r>
         <w:rPr>
           <w:rFonts w:hint="eastAsia"/>
@@ -3931,11 +4959,95 @@
       <w:pPr>
         <w:pStyle w:val="BodyText"/>
       </w:pPr>
-      <w:r>
-        <w:t xml:space="preserve">$$
-    F_k=I+A_{\rm SDC}(t_k)\Delta t
-    $$</w:t>
-      </w:r>
+      <m:oMathPara>
+        <m:oMathParaPr>
+          <m:jc m:val="center"/>
+        </m:oMathParaPr>
+        <m:oMath>
+          <m:sSub>
+            <m:e>
+              <m:r>
+                <m:t>F</m:t>
+              </m:r>
+            </m:e>
+            <m:sub>
+              <m:r>
+                <m:t>k</m:t>
+              </m:r>
+            </m:sub>
+          </m:sSub>
+          <m:r>
+            <m:rPr>
+              <m:sty m:val="p"/>
+            </m:rPr>
+            <m:t>=</m:t>
+          </m:r>
+          <m:r>
+            <m:t>I</m:t>
+          </m:r>
+          <m:r>
+            <m:rPr>
+              <m:sty m:val="p"/>
+            </m:rPr>
+            <m:t>+</m:t>
+          </m:r>
+          <m:sSub>
+            <m:e>
+              <m:r>
+                <m:t>A</m:t>
+              </m:r>
+            </m:e>
+            <m:sub>
+              <m:r>
+                <m:rPr>
+                  <m:sty m:val="p"/>
+                </m:rPr>
+                <m:t>S</m:t>
+              </m:r>
+              <m:r>
+                <m:rPr>
+                  <m:sty m:val="p"/>
+                </m:rPr>
+                <m:t>D</m:t>
+              </m:r>
+              <m:r>
+                <m:rPr>
+                  <m:sty m:val="p"/>
+                </m:rPr>
+                <m:t>C</m:t>
+              </m:r>
+            </m:sub>
+          </m:sSub>
+          <m:d>
+            <m:dPr>
+              <m:begChr m:val="("/>
+              <m:endChr m:val=")"/>
+              <m:sepChr m:val=""/>
+              <m:grow/>
+            </m:dPr>
+            <m:e>
+              <m:sSub>
+                <m:e>
+                  <m:r>
+                    <m:t>t</m:t>
+                  </m:r>
+                </m:e>
+                <m:sub>
+                  <m:r>
+                    <m:t>k</m:t>
+                  </m:r>
+                </m:sub>
+              </m:sSub>
+            </m:e>
+          </m:d>
+          <m:r>
+            <m:t>Δ</m:t>
+          </m:r>
+          <m:r>
+            <m:t>t</m:t>
+          </m:r>
+        </m:oMath>
+      </m:oMathPara>
     </w:p>
     <w:p>
       <w:pPr>
@@ -3961,11 +5073,147 @@
       <w:pPr>
         <w:pStyle w:val="BodyText"/>
       </w:pPr>
-      <w:r>
-        <w:t xml:space="preserve">$$
-    A_{\rm SDC}^TP+PA_{\rm SDC}-PBR^{-1}B^TP+Q=0
-    $$</w:t>
-      </w:r>
+      <m:oMathPara>
+        <m:oMathParaPr>
+          <m:jc m:val="center"/>
+        </m:oMathParaPr>
+        <m:oMath>
+          <m:sSubSup>
+            <m:e>
+              <m:r>
+                <m:t>A</m:t>
+              </m:r>
+            </m:e>
+            <m:sub>
+              <m:r>
+                <m:rPr>
+                  <m:sty m:val="p"/>
+                </m:rPr>
+                <m:t>S</m:t>
+              </m:r>
+              <m:r>
+                <m:rPr>
+                  <m:sty m:val="p"/>
+                </m:rPr>
+                <m:t>D</m:t>
+              </m:r>
+              <m:r>
+                <m:rPr>
+                  <m:sty m:val="p"/>
+                </m:rPr>
+                <m:t>C</m:t>
+              </m:r>
+            </m:sub>
+            <m:sup>
+              <m:r>
+                <m:t>T</m:t>
+              </m:r>
+            </m:sup>
+          </m:sSubSup>
+          <m:r>
+            <m:t>P</m:t>
+          </m:r>
+          <m:r>
+            <m:rPr>
+              <m:sty m:val="p"/>
+            </m:rPr>
+            <m:t>+</m:t>
+          </m:r>
+          <m:r>
+            <m:t>P</m:t>
+          </m:r>
+          <m:sSub>
+            <m:e>
+              <m:r>
+                <m:t>A</m:t>
+              </m:r>
+            </m:e>
+            <m:sub>
+              <m:r>
+                <m:rPr>
+                  <m:sty m:val="p"/>
+                </m:rPr>
+                <m:t>S</m:t>
+              </m:r>
+              <m:r>
+                <m:rPr>
+                  <m:sty m:val="p"/>
+                </m:rPr>
+                <m:t>D</m:t>
+              </m:r>
+              <m:r>
+                <m:rPr>
+                  <m:sty m:val="p"/>
+                </m:rPr>
+                <m:t>C</m:t>
+              </m:r>
+            </m:sub>
+          </m:sSub>
+          <m:r>
+            <m:rPr>
+              <m:sty m:val="p"/>
+            </m:rPr>
+            <m:t>−</m:t>
+          </m:r>
+          <m:r>
+            <m:t>P</m:t>
+          </m:r>
+          <m:r>
+            <m:t>B</m:t>
+          </m:r>
+          <m:sSup>
+            <m:e>
+              <m:r>
+                <m:t>R</m:t>
+              </m:r>
+            </m:e>
+            <m:sup>
+              <m:r>
+                <m:rPr>
+                  <m:sty m:val="p"/>
+                </m:rPr>
+                <m:t>−</m:t>
+              </m:r>
+              <m:r>
+                <m:t>1</m:t>
+              </m:r>
+            </m:sup>
+          </m:sSup>
+          <m:sSup>
+            <m:e>
+              <m:r>
+                <m:t>B</m:t>
+              </m:r>
+            </m:e>
+            <m:sup>
+              <m:r>
+                <m:t>T</m:t>
+              </m:r>
+            </m:sup>
+          </m:sSup>
+          <m:r>
+            <m:t>P</m:t>
+          </m:r>
+          <m:r>
+            <m:rPr>
+              <m:sty m:val="p"/>
+            </m:rPr>
+            <m:t>+</m:t>
+          </m:r>
+          <m:r>
+            <m:t>Q</m:t>
+          </m:r>
+          <m:r>
+            <m:rPr>
+              <m:sty m:val="p"/>
+            </m:rPr>
+            <m:t>=</m:t>
+          </m:r>
+          <m:r>
+            <m:t>0</m:t>
+          </m:r>
+        </m:oMath>
+      </m:oMathPara>
     </w:p>
     <w:p>
       <w:pPr>
@@ -4171,7 +5419,7 @@
       <w:r>
         <w:drawing>
           <wp:inline>
-            <wp:extent cx="4693920" cy="3237429"/>
+            <wp:extent cx="4693920" cy="2415458"/>
             <wp:effectExtent b="0" l="0" r="0" t="0"/>
             <wp:docPr descr="图2 统一 EKF-SDRE 算法流程，单个 SDC 矩阵同时服务估计与控制" title="" id="33" name="Picture"/>
             <a:graphic>
@@ -4192,7 +5440,7 @@
                   <pic:spPr bwMode="auto">
                     <a:xfrm>
                       <a:off x="0" y="0"/>
-                      <a:ext cx="4693920" cy="3237429"/>
+                      <a:ext cx="4693920" cy="2415458"/>
                     </a:xfrm>
                     <a:prstGeom prst="rect">
                       <a:avLst/>
@@ -4845,18 +6093,167 @@
       <w:r>
         <w:t xml:space="preserve"> </w:t>
       </w:r>
-      <w:r>
-        <w:t xml:space="preserve">$v\sim\mathcal{N}(0,R_{\rm EKF})$</w:t>
-      </w:r>
+      <m:oMath>
+        <m:r>
+          <m:t>v</m:t>
+        </m:r>
+        <m:r>
+          <m:rPr>
+            <m:sty m:val="p"/>
+          </m:rPr>
+          <m:t>∼</m:t>
+        </m:r>
+        <m:r>
+          <m:rPr>
+            <m:sty m:val="p"/>
+            <m:scr m:val="script"/>
+          </m:rPr>
+          <m:t>N</m:t>
+        </m:r>
+        <m:d>
+          <m:dPr>
+            <m:begChr m:val="("/>
+            <m:endChr m:val=")"/>
+            <m:sepChr m:val=""/>
+            <m:grow/>
+          </m:dPr>
+          <m:e>
+            <m:r>
+              <m:t>0</m:t>
+            </m:r>
+            <m:r>
+              <m:rPr>
+                <m:sty m:val="p"/>
+              </m:rPr>
+              <m:t>,</m:t>
+            </m:r>
+            <m:sSub>
+              <m:e>
+                <m:r>
+                  <m:t>R</m:t>
+                </m:r>
+              </m:e>
+              <m:sub>
+                <m:r>
+                  <m:rPr>
+                    <m:sty m:val="p"/>
+                  </m:rPr>
+                  <m:t>E</m:t>
+                </m:r>
+                <m:r>
+                  <m:rPr>
+                    <m:sty m:val="p"/>
+                  </m:rPr>
+                  <m:t>K</m:t>
+                </m:r>
+                <m:r>
+                  <m:rPr>
+                    <m:sty m:val="p"/>
+                  </m:rPr>
+                  <m:t>F</m:t>
+                </m:r>
+              </m:sub>
+            </m:sSub>
+          </m:e>
+        </m:d>
+      </m:oMath>
       <w:r>
         <w:rPr>
           <w:rFonts w:hint="eastAsia"/>
         </w:rPr>
         <w:t xml:space="preserve">，</w:t>
       </w:r>
-      <w:r>
-        <w:t xml:space="preserve">$R_{\rm EKF}=\operatorname{diag}(\sigma_\theta^2,\sigma_\theta^2)$</w:t>
-      </w:r>
+      <m:oMath>
+        <m:sSub>
+          <m:e>
+            <m:r>
+              <m:t>R</m:t>
+            </m:r>
+          </m:e>
+          <m:sub>
+            <m:r>
+              <m:rPr>
+                <m:sty m:val="p"/>
+              </m:rPr>
+              <m:t>E</m:t>
+            </m:r>
+            <m:r>
+              <m:rPr>
+                <m:sty m:val="p"/>
+              </m:rPr>
+              <m:t>K</m:t>
+            </m:r>
+            <m:r>
+              <m:rPr>
+                <m:sty m:val="p"/>
+              </m:rPr>
+              <m:t>F</m:t>
+            </m:r>
+          </m:sub>
+        </m:sSub>
+        <m:r>
+          <m:rPr>
+            <m:sty m:val="p"/>
+          </m:rPr>
+          <m:t>=</m:t>
+        </m:r>
+        <m:r>
+          <m:rPr>
+            <m:sty m:val="p"/>
+          </m:rPr>
+          <m:t>diag</m:t>
+        </m:r>
+        <m:d>
+          <m:dPr>
+            <m:begChr m:val="("/>
+            <m:endChr m:val=")"/>
+            <m:sepChr m:val=""/>
+            <m:grow/>
+          </m:dPr>
+          <m:e>
+            <m:sSubSup>
+              <m:e>
+                <m:r>
+                  <m:t>σ</m:t>
+                </m:r>
+              </m:e>
+              <m:sub>
+                <m:r>
+                  <m:t>θ</m:t>
+                </m:r>
+              </m:sub>
+              <m:sup>
+                <m:r>
+                  <m:t>2</m:t>
+                </m:r>
+              </m:sup>
+            </m:sSubSup>
+            <m:r>
+              <m:rPr>
+                <m:sty m:val="p"/>
+              </m:rPr>
+              <m:t>,</m:t>
+            </m:r>
+            <m:sSubSup>
+              <m:e>
+                <m:r>
+                  <m:t>σ</m:t>
+                </m:r>
+              </m:e>
+              <m:sub>
+                <m:r>
+                  <m:t>θ</m:t>
+                </m:r>
+              </m:sub>
+              <m:sup>
+                <m:r>
+                  <m:t>2</m:t>
+                </m:r>
+              </m:sup>
+            </m:sSubSup>
+          </m:e>
+        </m:d>
+      </m:oMath>
       <w:r>
         <w:rPr>
           <w:rFonts w:hint="eastAsia"/>
@@ -5076,11 +6473,229 @@
       <w:pPr>
         <w:pStyle w:val="FirstParagraph"/>
       </w:pPr>
-      <w:r>
-        <w:t xml:space="preserve">$$
-    P_{k+1|k}=F_kP_{k|k}F_k^T+Q_{\rm EKF},\quad F_k=I+A_{\rm SDC}(t_k)\Delta t.
-    $$</w:t>
-      </w:r>
+      <m:oMathPara>
+        <m:oMathParaPr>
+          <m:jc m:val="center"/>
+        </m:oMathParaPr>
+        <m:oMath>
+          <m:sSub>
+            <m:e>
+              <m:r>
+                <m:t>P</m:t>
+              </m:r>
+            </m:e>
+            <m:sub>
+              <m:r>
+                <m:t>k</m:t>
+              </m:r>
+              <m:r>
+                <m:rPr>
+                  <m:sty m:val="p"/>
+                </m:rPr>
+                <m:t>+</m:t>
+              </m:r>
+              <m:r>
+                <m:t>1</m:t>
+              </m:r>
+              <m:r>
+                <m:rPr>
+                  <m:sty m:val="p"/>
+                </m:rPr>
+                <m:t>|</m:t>
+              </m:r>
+              <m:r>
+                <m:t>k</m:t>
+              </m:r>
+            </m:sub>
+          </m:sSub>
+          <m:r>
+            <m:rPr>
+              <m:sty m:val="p"/>
+            </m:rPr>
+            <m:t>=</m:t>
+          </m:r>
+          <m:sSub>
+            <m:e>
+              <m:r>
+                <m:t>F</m:t>
+              </m:r>
+            </m:e>
+            <m:sub>
+              <m:r>
+                <m:t>k</m:t>
+              </m:r>
+            </m:sub>
+          </m:sSub>
+          <m:sSub>
+            <m:e>
+              <m:r>
+                <m:t>P</m:t>
+              </m:r>
+            </m:e>
+            <m:sub>
+              <m:r>
+                <m:t>k</m:t>
+              </m:r>
+              <m:r>
+                <m:rPr>
+                  <m:sty m:val="p"/>
+                </m:rPr>
+                <m:t>|</m:t>
+              </m:r>
+              <m:r>
+                <m:t>k</m:t>
+              </m:r>
+            </m:sub>
+          </m:sSub>
+          <m:sSubSup>
+            <m:e>
+              <m:r>
+                <m:t>F</m:t>
+              </m:r>
+            </m:e>
+            <m:sub>
+              <m:r>
+                <m:t>k</m:t>
+              </m:r>
+            </m:sub>
+            <m:sup>
+              <m:r>
+                <m:t>T</m:t>
+              </m:r>
+            </m:sup>
+          </m:sSubSup>
+          <m:r>
+            <m:rPr>
+              <m:sty m:val="p"/>
+            </m:rPr>
+            <m:t>+</m:t>
+          </m:r>
+          <m:sSub>
+            <m:e>
+              <m:r>
+                <m:t>Q</m:t>
+              </m:r>
+            </m:e>
+            <m:sub>
+              <m:r>
+                <m:rPr>
+                  <m:sty m:val="p"/>
+                </m:rPr>
+                <m:t>E</m:t>
+              </m:r>
+              <m:r>
+                <m:rPr>
+                  <m:sty m:val="p"/>
+                </m:rPr>
+                <m:t>K</m:t>
+              </m:r>
+              <m:r>
+                <m:rPr>
+                  <m:sty m:val="p"/>
+                </m:rPr>
+                <m:t>F</m:t>
+              </m:r>
+            </m:sub>
+          </m:sSub>
+          <m:r>
+            <m:rPr>
+              <m:sty m:val="p"/>
+            </m:rPr>
+            <m:t>,</m:t>
+          </m:r>
+          <m:r>
+            <m:t> </m:t>
+          </m:r>
+          <m:sSub>
+            <m:e>
+              <m:r>
+                <m:t>F</m:t>
+              </m:r>
+            </m:e>
+            <m:sub>
+              <m:r>
+                <m:t>k</m:t>
+              </m:r>
+            </m:sub>
+          </m:sSub>
+          <m:r>
+            <m:rPr>
+              <m:sty m:val="p"/>
+            </m:rPr>
+            <m:t>=</m:t>
+          </m:r>
+          <m:r>
+            <m:t>I</m:t>
+          </m:r>
+          <m:r>
+            <m:rPr>
+              <m:sty m:val="p"/>
+            </m:rPr>
+            <m:t>+</m:t>
+          </m:r>
+          <m:sSub>
+            <m:e>
+              <m:r>
+                <m:t>A</m:t>
+              </m:r>
+            </m:e>
+            <m:sub>
+              <m:r>
+                <m:rPr>
+                  <m:sty m:val="p"/>
+                </m:rPr>
+                <m:t>S</m:t>
+              </m:r>
+              <m:r>
+                <m:rPr>
+                  <m:sty m:val="p"/>
+                </m:rPr>
+                <m:t>D</m:t>
+              </m:r>
+              <m:r>
+                <m:rPr>
+                  <m:sty m:val="p"/>
+                </m:rPr>
+                <m:t>C</m:t>
+              </m:r>
+            </m:sub>
+          </m:sSub>
+          <m:d>
+            <m:dPr>
+              <m:begChr m:val="("/>
+              <m:endChr m:val=")"/>
+              <m:sepChr m:val=""/>
+              <m:grow/>
+            </m:dPr>
+            <m:e>
+              <m:sSub>
+                <m:e>
+                  <m:r>
+                    <m:t>t</m:t>
+                  </m:r>
+                </m:e>
+                <m:sub>
+                  <m:r>
+                    <m:t>k</m:t>
+                  </m:r>
+                </m:sub>
+              </m:sSub>
+            </m:e>
+          </m:d>
+          <m:r>
+            <m:t>Δ</m:t>
+          </m:r>
+          <m:r>
+            <m:t>t</m:t>
+          </m:r>
+          <m:r>
+            <m:rPr>
+              <m:sty m:val="p"/>
+            </m:rPr>
+            <m:t>.</m:t>
+          </m:r>
+        </m:oMath>
+      </m:oMathPara>
     </w:p>
     <w:p>
       <w:pPr>
@@ -5180,11 +6795,201 @@
       <w:pPr>
         <w:pStyle w:val="BodyText"/>
       </w:pPr>
-      <w:r>
-        <w:t xml:space="preserve">$$
-    K_k=P_{k+1|k}H_k^T(H_kP_{k+1|k}H_k^T+R_{\rm EKF})^{-1},
-    $$</w:t>
-      </w:r>
+      <m:oMathPara>
+        <m:oMathParaPr>
+          <m:jc m:val="center"/>
+        </m:oMathParaPr>
+        <m:oMath>
+          <m:sSub>
+            <m:e>
+              <m:r>
+                <m:t>K</m:t>
+              </m:r>
+            </m:e>
+            <m:sub>
+              <m:r>
+                <m:t>k</m:t>
+              </m:r>
+            </m:sub>
+          </m:sSub>
+          <m:r>
+            <m:rPr>
+              <m:sty m:val="p"/>
+            </m:rPr>
+            <m:t>=</m:t>
+          </m:r>
+          <m:sSub>
+            <m:e>
+              <m:r>
+                <m:t>P</m:t>
+              </m:r>
+            </m:e>
+            <m:sub>
+              <m:r>
+                <m:t>k</m:t>
+              </m:r>
+              <m:r>
+                <m:rPr>
+                  <m:sty m:val="p"/>
+                </m:rPr>
+                <m:t>+</m:t>
+              </m:r>
+              <m:r>
+                <m:t>1</m:t>
+              </m:r>
+              <m:r>
+                <m:rPr>
+                  <m:sty m:val="p"/>
+                </m:rPr>
+                <m:t>|</m:t>
+              </m:r>
+              <m:r>
+                <m:t>k</m:t>
+              </m:r>
+            </m:sub>
+          </m:sSub>
+          <m:sSubSup>
+            <m:e>
+              <m:r>
+                <m:t>H</m:t>
+              </m:r>
+            </m:e>
+            <m:sub>
+              <m:r>
+                <m:t>k</m:t>
+              </m:r>
+            </m:sub>
+            <m:sup>
+              <m:r>
+                <m:t>T</m:t>
+              </m:r>
+            </m:sup>
+          </m:sSubSup>
+          <m:sSup>
+            <m:e>
+              <m:d>
+                <m:dPr>
+                  <m:begChr m:val="("/>
+                  <m:endChr m:val=")"/>
+                  <m:sepChr m:val=""/>
+                  <m:grow/>
+                </m:dPr>
+                <m:e>
+                  <m:sSub>
+                    <m:e>
+                      <m:r>
+                        <m:t>H</m:t>
+                      </m:r>
+                    </m:e>
+                    <m:sub>
+                      <m:r>
+                        <m:t>k</m:t>
+                      </m:r>
+                    </m:sub>
+                  </m:sSub>
+                  <m:sSub>
+                    <m:e>
+                      <m:r>
+                        <m:t>P</m:t>
+                      </m:r>
+                    </m:e>
+                    <m:sub>
+                      <m:r>
+                        <m:t>k</m:t>
+                      </m:r>
+                      <m:r>
+                        <m:rPr>
+                          <m:sty m:val="p"/>
+                        </m:rPr>
+                        <m:t>+</m:t>
+                      </m:r>
+                      <m:r>
+                        <m:t>1</m:t>
+                      </m:r>
+                      <m:r>
+                        <m:rPr>
+                          <m:sty m:val="p"/>
+                        </m:rPr>
+                        <m:t>|</m:t>
+                      </m:r>
+                      <m:r>
+                        <m:t>k</m:t>
+                      </m:r>
+                    </m:sub>
+                  </m:sSub>
+                  <m:sSubSup>
+                    <m:e>
+                      <m:r>
+                        <m:t>H</m:t>
+                      </m:r>
+                    </m:e>
+                    <m:sub>
+                      <m:r>
+                        <m:t>k</m:t>
+                      </m:r>
+                    </m:sub>
+                    <m:sup>
+                      <m:r>
+                        <m:t>T</m:t>
+                      </m:r>
+                    </m:sup>
+                  </m:sSubSup>
+                  <m:r>
+                    <m:rPr>
+                      <m:sty m:val="p"/>
+                    </m:rPr>
+                    <m:t>+</m:t>
+                  </m:r>
+                  <m:sSub>
+                    <m:e>
+                      <m:r>
+                        <m:t>R</m:t>
+                      </m:r>
+                    </m:e>
+                    <m:sub>
+                      <m:r>
+                        <m:rPr>
+                          <m:sty m:val="p"/>
+                        </m:rPr>
+                        <m:t>E</m:t>
+                      </m:r>
+                      <m:r>
+                        <m:rPr>
+                          <m:sty m:val="p"/>
+                        </m:rPr>
+                        <m:t>K</m:t>
+                      </m:r>
+                      <m:r>
+                        <m:rPr>
+                          <m:sty m:val="p"/>
+                        </m:rPr>
+                        <m:t>F</m:t>
+                      </m:r>
+                    </m:sub>
+                  </m:sSub>
+                </m:e>
+              </m:d>
+            </m:e>
+            <m:sup>
+              <m:r>
+                <m:rPr>
+                  <m:sty m:val="p"/>
+                </m:rPr>
+                <m:t>−</m:t>
+              </m:r>
+              <m:r>
+                <m:t>1</m:t>
+              </m:r>
+            </m:sup>
+          </m:sSup>
+          <m:r>
+            <m:rPr>
+              <m:sty m:val="p"/>
+            </m:rPr>
+            <m:t>,</m:t>
+          </m:r>
+        </m:oMath>
+      </m:oMathPara>
     </w:p>
     <w:p>
       <w:pPr>
@@ -5532,11 +7337,278 @@
       <w:pPr>
         <w:pStyle w:val="BodyText"/>
       </w:pPr>
-      <w:r>
-        <w:t xml:space="preserve">$$
-    J=\frac{1}{2}\int_0^T(x^TQ_{\rm ctrl}x+u_p^TR_{\rm ctrl}u_p-\gamma^2u_e^TR_{\rm ctrl}u_e)\,dt.
-    $$</w:t>
-      </w:r>
+      <m:oMathPara>
+        <m:oMathParaPr>
+          <m:jc m:val="center"/>
+        </m:oMathParaPr>
+        <m:oMath>
+          <m:r>
+            <m:t>J</m:t>
+          </m:r>
+          <m:r>
+            <m:rPr>
+              <m:sty m:val="p"/>
+            </m:rPr>
+            <m:t>=</m:t>
+          </m:r>
+          <m:f>
+            <m:fPr>
+              <m:type m:val="bar"/>
+            </m:fPr>
+            <m:num>
+              <m:r>
+                <m:t>1</m:t>
+              </m:r>
+            </m:num>
+            <m:den>
+              <m:r>
+                <m:t>2</m:t>
+              </m:r>
+            </m:den>
+          </m:f>
+          <m:nary>
+            <m:naryPr>
+              <m:chr m:val="∫"/>
+              <m:limLoc m:val="subSup"/>
+              <m:subHide m:val="off"/>
+              <m:supHide m:val="off"/>
+            </m:naryPr>
+            <m:sub>
+              <m:r>
+                <m:t>0</m:t>
+              </m:r>
+            </m:sub>
+            <m:sup>
+              <m:r>
+                <m:t>T</m:t>
+              </m:r>
+            </m:sup>
+            <m:e>
+              <m:d>
+                <m:dPr>
+                  <m:begChr m:val="("/>
+                  <m:endChr m:val=")"/>
+                  <m:sepChr m:val=""/>
+                  <m:grow/>
+                </m:dPr>
+                <m:e>
+                  <m:sSup>
+                    <m:e>
+                      <m:r>
+                        <m:t>x</m:t>
+                      </m:r>
+                    </m:e>
+                    <m:sup>
+                      <m:r>
+                        <m:t>T</m:t>
+                      </m:r>
+                    </m:sup>
+                  </m:sSup>
+                  <m:sSub>
+                    <m:e>
+                      <m:r>
+                        <m:t>Q</m:t>
+                      </m:r>
+                    </m:e>
+                    <m:sub>
+                      <m:r>
+                        <m:rPr>
+                          <m:sty m:val="p"/>
+                        </m:rPr>
+                        <m:t>c</m:t>
+                      </m:r>
+                      <m:r>
+                        <m:rPr>
+                          <m:sty m:val="p"/>
+                        </m:rPr>
+                        <m:t>t</m:t>
+                      </m:r>
+                      <m:r>
+                        <m:rPr>
+                          <m:sty m:val="p"/>
+                        </m:rPr>
+                        <m:t>r</m:t>
+                      </m:r>
+                      <m:r>
+                        <m:rPr>
+                          <m:sty m:val="p"/>
+                        </m:rPr>
+                        <m:t>l</m:t>
+                      </m:r>
+                    </m:sub>
+                  </m:sSub>
+                  <m:r>
+                    <m:t>x</m:t>
+                  </m:r>
+                  <m:r>
+                    <m:rPr>
+                      <m:sty m:val="p"/>
+                    </m:rPr>
+                    <m:t>+</m:t>
+                  </m:r>
+                  <m:sSubSup>
+                    <m:e>
+                      <m:r>
+                        <m:t>u</m:t>
+                      </m:r>
+                    </m:e>
+                    <m:sub>
+                      <m:r>
+                        <m:t>p</m:t>
+                      </m:r>
+                    </m:sub>
+                    <m:sup>
+                      <m:r>
+                        <m:t>T</m:t>
+                      </m:r>
+                    </m:sup>
+                  </m:sSubSup>
+                  <m:sSub>
+                    <m:e>
+                      <m:r>
+                        <m:t>R</m:t>
+                      </m:r>
+                    </m:e>
+                    <m:sub>
+                      <m:r>
+                        <m:rPr>
+                          <m:sty m:val="p"/>
+                        </m:rPr>
+                        <m:t>c</m:t>
+                      </m:r>
+                      <m:r>
+                        <m:rPr>
+                          <m:sty m:val="p"/>
+                        </m:rPr>
+                        <m:t>t</m:t>
+                      </m:r>
+                      <m:r>
+                        <m:rPr>
+                          <m:sty m:val="p"/>
+                        </m:rPr>
+                        <m:t>r</m:t>
+                      </m:r>
+                      <m:r>
+                        <m:rPr>
+                          <m:sty m:val="p"/>
+                        </m:rPr>
+                        <m:t>l</m:t>
+                      </m:r>
+                    </m:sub>
+                  </m:sSub>
+                  <m:sSub>
+                    <m:e>
+                      <m:r>
+                        <m:t>u</m:t>
+                      </m:r>
+                    </m:e>
+                    <m:sub>
+                      <m:r>
+                        <m:t>p</m:t>
+                      </m:r>
+                    </m:sub>
+                  </m:sSub>
+                  <m:r>
+                    <m:rPr>
+                      <m:sty m:val="p"/>
+                    </m:rPr>
+                    <m:t>−</m:t>
+                  </m:r>
+                  <m:sSup>
+                    <m:e>
+                      <m:r>
+                        <m:t>γ</m:t>
+                      </m:r>
+                    </m:e>
+                    <m:sup>
+                      <m:r>
+                        <m:t>2</m:t>
+                      </m:r>
+                    </m:sup>
+                  </m:sSup>
+                  <m:sSubSup>
+                    <m:e>
+                      <m:r>
+                        <m:t>u</m:t>
+                      </m:r>
+                    </m:e>
+                    <m:sub>
+                      <m:r>
+                        <m:t>e</m:t>
+                      </m:r>
+                    </m:sub>
+                    <m:sup>
+                      <m:r>
+                        <m:t>T</m:t>
+                      </m:r>
+                    </m:sup>
+                  </m:sSubSup>
+                  <m:sSub>
+                    <m:e>
+                      <m:r>
+                        <m:t>R</m:t>
+                      </m:r>
+                    </m:e>
+                    <m:sub>
+                      <m:r>
+                        <m:rPr>
+                          <m:sty m:val="p"/>
+                        </m:rPr>
+                        <m:t>c</m:t>
+                      </m:r>
+                      <m:r>
+                        <m:rPr>
+                          <m:sty m:val="p"/>
+                        </m:rPr>
+                        <m:t>t</m:t>
+                      </m:r>
+                      <m:r>
+                        <m:rPr>
+                          <m:sty m:val="p"/>
+                        </m:rPr>
+                        <m:t>r</m:t>
+                      </m:r>
+                      <m:r>
+                        <m:rPr>
+                          <m:sty m:val="p"/>
+                        </m:rPr>
+                        <m:t>l</m:t>
+                      </m:r>
+                    </m:sub>
+                  </m:sSub>
+                  <m:sSub>
+                    <m:e>
+                      <m:r>
+                        <m:t>u</m:t>
+                      </m:r>
+                    </m:e>
+                    <m:sub>
+                      <m:r>
+                        <m:t>e</m:t>
+                      </m:r>
+                    </m:sub>
+                  </m:sSub>
+                </m:e>
+              </m:d>
+            </m:e>
+          </m:nary>
+          <m:r>
+            <m:t> </m:t>
+          </m:r>
+          <m:r>
+            <m:t>d</m:t>
+          </m:r>
+          <m:r>
+            <m:t>t</m:t>
+          </m:r>
+          <m:r>
+            <m:rPr>
+              <m:sty m:val="p"/>
+            </m:rPr>
+            <m:t>.</m:t>
+          </m:r>
+        </m:oMath>
+      </m:oMathPara>
     </w:p>
     <w:p>
       <w:pPr>
@@ -5551,9 +7623,35 @@
       <w:r>
         <w:t xml:space="preserve"> </w:t>
       </w:r>
-      <w:r>
-        <w:t xml:space="preserve">$A_{\rm SDC}$</w:t>
-      </w:r>
+      <m:oMath>
+        <m:sSub>
+          <m:e>
+            <m:r>
+              <m:t>A</m:t>
+            </m:r>
+          </m:e>
+          <m:sub>
+            <m:r>
+              <m:rPr>
+                <m:sty m:val="p"/>
+              </m:rPr>
+              <m:t>S</m:t>
+            </m:r>
+            <m:r>
+              <m:rPr>
+                <m:sty m:val="p"/>
+              </m:rPr>
+              <m:t>D</m:t>
+            </m:r>
+            <m:r>
+              <m:rPr>
+                <m:sty m:val="p"/>
+              </m:rPr>
+              <m:t>C</m:t>
+            </m:r>
+          </m:sub>
+        </m:sSub>
+      </m:oMath>
       <w:r>
         <w:rPr>
           <w:rFonts w:hint="eastAsia"/>
@@ -5613,11 +7711,130 @@
       <w:pPr>
         <w:pStyle w:val="BodyText"/>
       </w:pPr>
-      <w:r>
-        <w:t xml:space="preserve">$$
-    u_p=-R_{\rm ctrl}^{-1}B^TP\hat{x}_{k|k}.
-    $$</w:t>
-      </w:r>
+      <m:oMathPara>
+        <m:oMathParaPr>
+          <m:jc m:val="center"/>
+        </m:oMathParaPr>
+        <m:oMath>
+          <m:sSub>
+            <m:e>
+              <m:r>
+                <m:t>u</m:t>
+              </m:r>
+            </m:e>
+            <m:sub>
+              <m:r>
+                <m:t>p</m:t>
+              </m:r>
+            </m:sub>
+          </m:sSub>
+          <m:r>
+            <m:rPr>
+              <m:sty m:val="p"/>
+            </m:rPr>
+            <m:t>=</m:t>
+          </m:r>
+          <m:r>
+            <m:rPr>
+              <m:sty m:val="p"/>
+            </m:rPr>
+            <m:t>−</m:t>
+          </m:r>
+          <m:sSubSup>
+            <m:e>
+              <m:r>
+                <m:t>R</m:t>
+              </m:r>
+            </m:e>
+            <m:sub>
+              <m:r>
+                <m:rPr>
+                  <m:sty m:val="p"/>
+                </m:rPr>
+                <m:t>c</m:t>
+              </m:r>
+              <m:r>
+                <m:rPr>
+                  <m:sty m:val="p"/>
+                </m:rPr>
+                <m:t>t</m:t>
+              </m:r>
+              <m:r>
+                <m:rPr>
+                  <m:sty m:val="p"/>
+                </m:rPr>
+                <m:t>r</m:t>
+              </m:r>
+              <m:r>
+                <m:rPr>
+                  <m:sty m:val="p"/>
+                </m:rPr>
+                <m:t>l</m:t>
+              </m:r>
+            </m:sub>
+            <m:sup>
+              <m:r>
+                <m:rPr>
+                  <m:sty m:val="p"/>
+                </m:rPr>
+                <m:t>−</m:t>
+              </m:r>
+              <m:r>
+                <m:t>1</m:t>
+              </m:r>
+            </m:sup>
+          </m:sSubSup>
+          <m:sSup>
+            <m:e>
+              <m:r>
+                <m:t>B</m:t>
+              </m:r>
+            </m:e>
+            <m:sup>
+              <m:r>
+                <m:t>T</m:t>
+              </m:r>
+            </m:sup>
+          </m:sSup>
+          <m:r>
+            <m:t>P</m:t>
+          </m:r>
+          <m:sSub>
+            <m:e>
+              <m:acc>
+                <m:accPr>
+                  <m:chr m:val="̂"/>
+                </m:accPr>
+                <m:e>
+                  <m:r>
+                    <m:t>x</m:t>
+                  </m:r>
+                </m:e>
+              </m:acc>
+            </m:e>
+            <m:sub>
+              <m:r>
+                <m:t>k</m:t>
+              </m:r>
+              <m:r>
+                <m:rPr>
+                  <m:sty m:val="p"/>
+                </m:rPr>
+                <m:t>|</m:t>
+              </m:r>
+              <m:r>
+                <m:t>k</m:t>
+              </m:r>
+            </m:sub>
+          </m:sSub>
+          <m:r>
+            <m:rPr>
+              <m:sty m:val="p"/>
+            </m:rPr>
+            <m:t>.</m:t>
+          </m:r>
+        </m:oMath>
+      </m:oMathPara>
     </w:p>
     <w:p>
       <w:pPr>
@@ -5632,18 +7849,130 @@
       <w:r>
         <w:t xml:space="preserve"> </w:t>
       </w:r>
-      <w:r>
-        <w:t xml:space="preserve">$Q_{\rm ctrl}=I_6$</w:t>
-      </w:r>
+      <m:oMath>
+        <m:sSub>
+          <m:e>
+            <m:r>
+              <m:t>Q</m:t>
+            </m:r>
+          </m:e>
+          <m:sub>
+            <m:r>
+              <m:rPr>
+                <m:sty m:val="p"/>
+              </m:rPr>
+              <m:t>c</m:t>
+            </m:r>
+            <m:r>
+              <m:rPr>
+                <m:sty m:val="p"/>
+              </m:rPr>
+              <m:t>t</m:t>
+            </m:r>
+            <m:r>
+              <m:rPr>
+                <m:sty m:val="p"/>
+              </m:rPr>
+              <m:t>r</m:t>
+            </m:r>
+            <m:r>
+              <m:rPr>
+                <m:sty m:val="p"/>
+              </m:rPr>
+              <m:t>l</m:t>
+            </m:r>
+          </m:sub>
+        </m:sSub>
+        <m:r>
+          <m:rPr>
+            <m:sty m:val="p"/>
+          </m:rPr>
+          <m:t>=</m:t>
+        </m:r>
+        <m:sSub>
+          <m:e>
+            <m:r>
+              <m:t>I</m:t>
+            </m:r>
+          </m:e>
+          <m:sub>
+            <m:r>
+              <m:t>6</m:t>
+            </m:r>
+          </m:sub>
+        </m:sSub>
+      </m:oMath>
       <w:r>
         <w:rPr>
           <w:rFonts w:hint="eastAsia"/>
         </w:rPr>
         <w:t xml:space="preserve">，</w:t>
       </w:r>
-      <w:r>
-        <w:t xml:space="preserve">$R_{\rm ctrl}=10^{13}I_3$</w:t>
-      </w:r>
+      <m:oMath>
+        <m:sSub>
+          <m:e>
+            <m:r>
+              <m:t>R</m:t>
+            </m:r>
+          </m:e>
+          <m:sub>
+            <m:r>
+              <m:rPr>
+                <m:sty m:val="p"/>
+              </m:rPr>
+              <m:t>c</m:t>
+            </m:r>
+            <m:r>
+              <m:rPr>
+                <m:sty m:val="p"/>
+              </m:rPr>
+              <m:t>t</m:t>
+            </m:r>
+            <m:r>
+              <m:rPr>
+                <m:sty m:val="p"/>
+              </m:rPr>
+              <m:t>r</m:t>
+            </m:r>
+            <m:r>
+              <m:rPr>
+                <m:sty m:val="p"/>
+              </m:rPr>
+              <m:t>l</m:t>
+            </m:r>
+          </m:sub>
+        </m:sSub>
+        <m:r>
+          <m:rPr>
+            <m:sty m:val="p"/>
+          </m:rPr>
+          <m:t>=</m:t>
+        </m:r>
+        <m:sSup>
+          <m:e>
+            <m:r>
+              <m:t>10</m:t>
+            </m:r>
+          </m:e>
+          <m:sup>
+            <m:r>
+              <m:t>13</m:t>
+            </m:r>
+          </m:sup>
+        </m:sSup>
+        <m:sSub>
+          <m:e>
+            <m:r>
+              <m:t>I</m:t>
+            </m:r>
+          </m:e>
+          <m:sub>
+            <m:r>
+              <m:t>3</m:t>
+            </m:r>
+          </m:sub>
+        </m:sSub>
+      </m:oMath>
       <w:r>
         <w:rPr>
           <w:rFonts w:hint="eastAsia"/>
@@ -5653,9 +7982,41 @@
       <w:r>
         <w:t xml:space="preserve"> </w:t>
       </w:r>
-      <w:r>
-        <w:t xml:space="preserve">$Q_{\rm ctrl}$</w:t>
-      </w:r>
+      <m:oMath>
+        <m:sSub>
+          <m:e>
+            <m:r>
+              <m:t>Q</m:t>
+            </m:r>
+          </m:e>
+          <m:sub>
+            <m:r>
+              <m:rPr>
+                <m:sty m:val="p"/>
+              </m:rPr>
+              <m:t>c</m:t>
+            </m:r>
+            <m:r>
+              <m:rPr>
+                <m:sty m:val="p"/>
+              </m:rPr>
+              <m:t>t</m:t>
+            </m:r>
+            <m:r>
+              <m:rPr>
+                <m:sty m:val="p"/>
+              </m:rPr>
+              <m:t>r</m:t>
+            </m:r>
+            <m:r>
+              <m:rPr>
+                <m:sty m:val="p"/>
+              </m:rPr>
+              <m:t>l</m:t>
+            </m:r>
+          </m:sub>
+        </m:sSub>
+      </m:oMath>
       <w:r>
         <w:t xml:space="preserve"> </w:t>
       </w:r>
@@ -5668,9 +8029,67 @@
       <w:r>
         <w:t xml:space="preserve"> </w:t>
       </w:r>
-      <w:r>
-        <w:t xml:space="preserve">$B R_{\rm ctrl}^{-1}B^T$</w:t>
-      </w:r>
+      <m:oMath>
+        <m:r>
+          <m:t>B</m:t>
+        </m:r>
+        <m:sSubSup>
+          <m:e>
+            <m:r>
+              <m:t>R</m:t>
+            </m:r>
+          </m:e>
+          <m:sub>
+            <m:r>
+              <m:rPr>
+                <m:sty m:val="p"/>
+              </m:rPr>
+              <m:t>c</m:t>
+            </m:r>
+            <m:r>
+              <m:rPr>
+                <m:sty m:val="p"/>
+              </m:rPr>
+              <m:t>t</m:t>
+            </m:r>
+            <m:r>
+              <m:rPr>
+                <m:sty m:val="p"/>
+              </m:rPr>
+              <m:t>r</m:t>
+            </m:r>
+            <m:r>
+              <m:rPr>
+                <m:sty m:val="p"/>
+              </m:rPr>
+              <m:t>l</m:t>
+            </m:r>
+          </m:sub>
+          <m:sup>
+            <m:r>
+              <m:rPr>
+                <m:sty m:val="p"/>
+              </m:rPr>
+              <m:t>−</m:t>
+            </m:r>
+            <m:r>
+              <m:t>1</m:t>
+            </m:r>
+          </m:sup>
+        </m:sSubSup>
+        <m:sSup>
+          <m:e>
+            <m:r>
+              <m:t>B</m:t>
+            </m:r>
+          </m:e>
+          <m:sup>
+            <m:r>
+              <m:t>T</m:t>
+            </m:r>
+          </m:sup>
+        </m:sSup>
+      </m:oMath>
       <w:r>
         <w:t xml:space="preserve"> </w:t>
       </w:r>
@@ -5694,11 +8113,161 @@
       <w:pPr>
         <w:pStyle w:val="BodyText"/>
       </w:pPr>
-      <w:r>
-        <w:t xml:space="preserve">$$
-    \alpha=\sqrt{\frac{\|Q_{\rm ctrl}\|}{\|B R_{\rm ctrl}^{-1}B^T\|}},
-    $$</w:t>
-      </w:r>
+      <m:oMathPara>
+        <m:oMathParaPr>
+          <m:jc m:val="center"/>
+        </m:oMathParaPr>
+        <m:oMath>
+          <m:r>
+            <m:t>α</m:t>
+          </m:r>
+          <m:r>
+            <m:rPr>
+              <m:sty m:val="p"/>
+            </m:rPr>
+            <m:t>=</m:t>
+          </m:r>
+          <m:rad>
+            <m:radPr>
+              <m:degHide m:val="on"/>
+            </m:radPr>
+            <m:deg/>
+            <m:e>
+              <m:f>
+                <m:fPr>
+                  <m:type m:val="bar"/>
+                </m:fPr>
+                <m:num>
+                  <m:r>
+                    <m:rPr>
+                      <m:sty m:val="p"/>
+                    </m:rPr>
+                    <m:t>∥</m:t>
+                  </m:r>
+                  <m:sSub>
+                    <m:e>
+                      <m:r>
+                        <m:t>Q</m:t>
+                      </m:r>
+                    </m:e>
+                    <m:sub>
+                      <m:r>
+                        <m:rPr>
+                          <m:sty m:val="p"/>
+                        </m:rPr>
+                        <m:t>c</m:t>
+                      </m:r>
+                      <m:r>
+                        <m:rPr>
+                          <m:sty m:val="p"/>
+                        </m:rPr>
+                        <m:t>t</m:t>
+                      </m:r>
+                      <m:r>
+                        <m:rPr>
+                          <m:sty m:val="p"/>
+                        </m:rPr>
+                        <m:t>r</m:t>
+                      </m:r>
+                      <m:r>
+                        <m:rPr>
+                          <m:sty m:val="p"/>
+                        </m:rPr>
+                        <m:t>l</m:t>
+                      </m:r>
+                    </m:sub>
+                  </m:sSub>
+                  <m:r>
+                    <m:rPr>
+                      <m:sty m:val="p"/>
+                    </m:rPr>
+                    <m:t>∥</m:t>
+                  </m:r>
+                </m:num>
+                <m:den>
+                  <m:r>
+                    <m:rPr>
+                      <m:sty m:val="p"/>
+                    </m:rPr>
+                    <m:t>∥</m:t>
+                  </m:r>
+                  <m:r>
+                    <m:t>B</m:t>
+                  </m:r>
+                  <m:sSubSup>
+                    <m:e>
+                      <m:r>
+                        <m:t>R</m:t>
+                      </m:r>
+                    </m:e>
+                    <m:sub>
+                      <m:r>
+                        <m:rPr>
+                          <m:sty m:val="p"/>
+                        </m:rPr>
+                        <m:t>c</m:t>
+                      </m:r>
+                      <m:r>
+                        <m:rPr>
+                          <m:sty m:val="p"/>
+                        </m:rPr>
+                        <m:t>t</m:t>
+                      </m:r>
+                      <m:r>
+                        <m:rPr>
+                          <m:sty m:val="p"/>
+                        </m:rPr>
+                        <m:t>r</m:t>
+                      </m:r>
+                      <m:r>
+                        <m:rPr>
+                          <m:sty m:val="p"/>
+                        </m:rPr>
+                        <m:t>l</m:t>
+                      </m:r>
+                    </m:sub>
+                    <m:sup>
+                      <m:r>
+                        <m:rPr>
+                          <m:sty m:val="p"/>
+                        </m:rPr>
+                        <m:t>−</m:t>
+                      </m:r>
+                      <m:r>
+                        <m:t>1</m:t>
+                      </m:r>
+                    </m:sup>
+                  </m:sSubSup>
+                  <m:sSup>
+                    <m:e>
+                      <m:r>
+                        <m:t>B</m:t>
+                      </m:r>
+                    </m:e>
+                    <m:sup>
+                      <m:r>
+                        <m:t>T</m:t>
+                      </m:r>
+                    </m:sup>
+                  </m:sSup>
+                  <m:r>
+                    <m:rPr>
+                      <m:sty m:val="p"/>
+                    </m:rPr>
+                    <m:t>∥</m:t>
+                  </m:r>
+                </m:den>
+              </m:f>
+            </m:e>
+          </m:rad>
+          <m:r>
+            <m:rPr>
+              <m:sty m:val="p"/>
+            </m:rPr>
+            <m:t>,</m:t>
+          </m:r>
+        </m:oMath>
+      </m:oMathPara>
     </w:p>
     <w:p>
       <w:pPr>
@@ -5801,9 +8370,35 @@
       <w:r>
         <w:t xml:space="preserve"> </w:t>
       </w:r>
-      <w:r>
-        <w:t xml:space="preserve">$A_{\rm SDC}$</w:t>
-      </w:r>
+      <m:oMath>
+        <m:sSub>
+          <m:e>
+            <m:r>
+              <m:t>A</m:t>
+            </m:r>
+          </m:e>
+          <m:sub>
+            <m:r>
+              <m:rPr>
+                <m:sty m:val="p"/>
+              </m:rPr>
+              <m:t>S</m:t>
+            </m:r>
+            <m:r>
+              <m:rPr>
+                <m:sty m:val="p"/>
+              </m:rPr>
+              <m:t>D</m:t>
+            </m:r>
+            <m:r>
+              <m:rPr>
+                <m:sty m:val="p"/>
+              </m:rPr>
+              <m:t>C</m:t>
+            </m:r>
+          </m:sub>
+        </m:sSub>
+      </m:oMath>
       <w:r>
         <w:t xml:space="preserve"> </w:t>
       </w:r>
@@ -6046,9 +8641,35 @@
       <w:r>
         <w:t xml:space="preserve"> </w:t>
       </w:r>
-      <w:r>
-        <w:t xml:space="preserve">$A_{\rm SDC}$</w:t>
-      </w:r>
+      <m:oMath>
+        <m:sSub>
+          <m:e>
+            <m:r>
+              <m:t>A</m:t>
+            </m:r>
+          </m:e>
+          <m:sub>
+            <m:r>
+              <m:rPr>
+                <m:sty m:val="p"/>
+              </m:rPr>
+              <m:t>S</m:t>
+            </m:r>
+            <m:r>
+              <m:rPr>
+                <m:sty m:val="p"/>
+              </m:rPr>
+              <m:t>D</m:t>
+            </m:r>
+            <m:r>
+              <m:rPr>
+                <m:sty m:val="p"/>
+              </m:rPr>
+              <m:t>C</m:t>
+            </m:r>
+          </m:sub>
+        </m:sSub>
+      </m:oMath>
       <w:r>
         <w:rPr>
           <w:rFonts w:hint="eastAsia"/>
@@ -6085,9 +8706,35 @@
       <w:r>
         <w:t xml:space="preserve"> </w:t>
       </w:r>
-      <w:r>
-        <w:t xml:space="preserve">$A_{\rm SDC}$</w:t>
-      </w:r>
+      <m:oMath>
+        <m:sSub>
+          <m:e>
+            <m:r>
+              <m:t>A</m:t>
+            </m:r>
+          </m:e>
+          <m:sub>
+            <m:r>
+              <m:rPr>
+                <m:sty m:val="p"/>
+              </m:rPr>
+              <m:t>S</m:t>
+            </m:r>
+            <m:r>
+              <m:rPr>
+                <m:sty m:val="p"/>
+              </m:rPr>
+              <m:t>D</m:t>
+            </m:r>
+            <m:r>
+              <m:rPr>
+                <m:sty m:val="p"/>
+              </m:rPr>
+              <m:t>C</m:t>
+            </m:r>
+          </m:sub>
+        </m:sSub>
+      </m:oMath>
       <w:r>
         <w:t xml:space="preserve"> </w:t>
       </w:r>
@@ -6297,9 +8944,89 @@
         </w:rPr>
         <w:t xml:space="preserve">椭圆参考轨道：</w:t>
       </w:r>
-      <w:r>
-        <w:t xml:space="preserve">$\mu=3.986\times10^5\ {\rm km^3/s^2}$</w:t>
-      </w:r>
+      <m:oMath>
+        <m:r>
+          <m:t>μ</m:t>
+        </m:r>
+        <m:r>
+          <m:rPr>
+            <m:sty m:val="p"/>
+          </m:rPr>
+          <m:t>=</m:t>
+        </m:r>
+        <m:r>
+          <m:t>3.986</m:t>
+        </m:r>
+        <m:r>
+          <m:rPr>
+            <m:sty m:val="p"/>
+          </m:rPr>
+          <m:t>×</m:t>
+        </m:r>
+        <m:sSup>
+          <m:e>
+            <m:r>
+              <m:t>10</m:t>
+            </m:r>
+          </m:e>
+          <m:sup>
+            <m:r>
+              <m:t>5</m:t>
+            </m:r>
+          </m:sup>
+        </m:sSup>
+        <m:r>
+          <m:t> </m:t>
+        </m:r>
+        <m:r>
+          <m:rPr>
+            <m:sty m:val="p"/>
+          </m:rPr>
+          <m:t>k</m:t>
+        </m:r>
+        <m:sSup>
+          <m:e>
+            <m:r>
+              <m:rPr>
+                <m:sty m:val="p"/>
+              </m:rPr>
+              <m:t>m</m:t>
+            </m:r>
+          </m:e>
+          <m:sup>
+            <m:r>
+              <m:rPr>
+                <m:sty m:val="p"/>
+              </m:rPr>
+              <m:t>3</m:t>
+            </m:r>
+          </m:sup>
+        </m:sSup>
+        <m:r>
+          <m:rPr>
+            <m:sty m:val="p"/>
+          </m:rPr>
+          <m:t>/</m:t>
+        </m:r>
+        <m:sSup>
+          <m:e>
+            <m:r>
+              <m:rPr>
+                <m:sty m:val="p"/>
+              </m:rPr>
+              <m:t>s</m:t>
+            </m:r>
+          </m:e>
+          <m:sup>
+            <m:r>
+              <m:rPr>
+                <m:sty m:val="p"/>
+              </m:rPr>
+              <m:t>2</m:t>
+            </m:r>
+          </m:sup>
+        </m:sSup>
+      </m:oMath>
       <w:r>
         <w:rPr>
           <w:rFonts w:hint="eastAsia"/>
@@ -6602,11 +9329,152 @@
       <w:pPr>
         <w:pStyle w:val="BodyText"/>
       </w:pPr>
-      <w:r>
-        <w:t xml:space="preserve">$$
-    Q_{\rm EKF}=\operatorname{diag}(5\times10^{-4}I_3,5\times10^{-8}I_3).
-    $$</w:t>
-      </w:r>
+      <m:oMathPara>
+        <m:oMathParaPr>
+          <m:jc m:val="center"/>
+        </m:oMathParaPr>
+        <m:oMath>
+          <m:sSub>
+            <m:e>
+              <m:r>
+                <m:t>Q</m:t>
+              </m:r>
+            </m:e>
+            <m:sub>
+              <m:r>
+                <m:rPr>
+                  <m:sty m:val="p"/>
+                </m:rPr>
+                <m:t>E</m:t>
+              </m:r>
+              <m:r>
+                <m:rPr>
+                  <m:sty m:val="p"/>
+                </m:rPr>
+                <m:t>K</m:t>
+              </m:r>
+              <m:r>
+                <m:rPr>
+                  <m:sty m:val="p"/>
+                </m:rPr>
+                <m:t>F</m:t>
+              </m:r>
+            </m:sub>
+          </m:sSub>
+          <m:r>
+            <m:rPr>
+              <m:sty m:val="p"/>
+            </m:rPr>
+            <m:t>=</m:t>
+          </m:r>
+          <m:r>
+            <m:rPr>
+              <m:sty m:val="p"/>
+            </m:rPr>
+            <m:t>diag</m:t>
+          </m:r>
+          <m:d>
+            <m:dPr>
+              <m:begChr m:val="("/>
+              <m:endChr m:val=")"/>
+              <m:sepChr m:val=""/>
+              <m:grow/>
+            </m:dPr>
+            <m:e>
+              <m:r>
+                <m:t>5</m:t>
+              </m:r>
+              <m:r>
+                <m:rPr>
+                  <m:sty m:val="p"/>
+                </m:rPr>
+                <m:t>×</m:t>
+              </m:r>
+              <m:sSup>
+                <m:e>
+                  <m:r>
+                    <m:t>10</m:t>
+                  </m:r>
+                </m:e>
+                <m:sup>
+                  <m:r>
+                    <m:rPr>
+                      <m:sty m:val="p"/>
+                    </m:rPr>
+                    <m:t>−</m:t>
+                  </m:r>
+                  <m:r>
+                    <m:t>4</m:t>
+                  </m:r>
+                </m:sup>
+              </m:sSup>
+              <m:sSub>
+                <m:e>
+                  <m:r>
+                    <m:t>I</m:t>
+                  </m:r>
+                </m:e>
+                <m:sub>
+                  <m:r>
+                    <m:t>3</m:t>
+                  </m:r>
+                </m:sub>
+              </m:sSub>
+              <m:r>
+                <m:rPr>
+                  <m:sty m:val="p"/>
+                </m:rPr>
+                <m:t>,</m:t>
+              </m:r>
+              <m:r>
+                <m:t>5</m:t>
+              </m:r>
+              <m:r>
+                <m:rPr>
+                  <m:sty m:val="p"/>
+                </m:rPr>
+                <m:t>×</m:t>
+              </m:r>
+              <m:sSup>
+                <m:e>
+                  <m:r>
+                    <m:t>10</m:t>
+                  </m:r>
+                </m:e>
+                <m:sup>
+                  <m:r>
+                    <m:rPr>
+                      <m:sty m:val="p"/>
+                    </m:rPr>
+                    <m:t>−</m:t>
+                  </m:r>
+                  <m:r>
+                    <m:t>8</m:t>
+                  </m:r>
+                </m:sup>
+              </m:sSup>
+              <m:sSub>
+                <m:e>
+                  <m:r>
+                    <m:t>I</m:t>
+                  </m:r>
+                </m:e>
+                <m:sub>
+                  <m:r>
+                    <m:t>3</m:t>
+                  </m:r>
+                </m:sub>
+              </m:sSub>
+            </m:e>
+          </m:d>
+          <m:r>
+            <m:rPr>
+              <m:sty m:val="p"/>
+            </m:rPr>
+            <m:t>.</m:t>
+          </m:r>
+        </m:oMath>
+      </m:oMathPara>
     </w:p>
     <w:p>
       <w:pPr>
@@ -6685,18 +9553,130 @@
       <w:r>
         <w:t xml:space="preserve"> </w:t>
       </w:r>
-      <w:r>
-        <w:t xml:space="preserve">$Q_{\rm ctrl}=I_6$</w:t>
-      </w:r>
+      <m:oMath>
+        <m:sSub>
+          <m:e>
+            <m:r>
+              <m:t>Q</m:t>
+            </m:r>
+          </m:e>
+          <m:sub>
+            <m:r>
+              <m:rPr>
+                <m:sty m:val="p"/>
+              </m:rPr>
+              <m:t>c</m:t>
+            </m:r>
+            <m:r>
+              <m:rPr>
+                <m:sty m:val="p"/>
+              </m:rPr>
+              <m:t>t</m:t>
+            </m:r>
+            <m:r>
+              <m:rPr>
+                <m:sty m:val="p"/>
+              </m:rPr>
+              <m:t>r</m:t>
+            </m:r>
+            <m:r>
+              <m:rPr>
+                <m:sty m:val="p"/>
+              </m:rPr>
+              <m:t>l</m:t>
+            </m:r>
+          </m:sub>
+        </m:sSub>
+        <m:r>
+          <m:rPr>
+            <m:sty m:val="p"/>
+          </m:rPr>
+          <m:t>=</m:t>
+        </m:r>
+        <m:sSub>
+          <m:e>
+            <m:r>
+              <m:t>I</m:t>
+            </m:r>
+          </m:e>
+          <m:sub>
+            <m:r>
+              <m:t>6</m:t>
+            </m:r>
+          </m:sub>
+        </m:sSub>
+      </m:oMath>
       <w:r>
         <w:rPr>
           <w:rFonts w:hint="eastAsia"/>
         </w:rPr>
         <w:t xml:space="preserve">，</w:t>
       </w:r>
-      <w:r>
-        <w:t xml:space="preserve">$R_{\rm ctrl}=10^{13}I_3$</w:t>
-      </w:r>
+      <m:oMath>
+        <m:sSub>
+          <m:e>
+            <m:r>
+              <m:t>R</m:t>
+            </m:r>
+          </m:e>
+          <m:sub>
+            <m:r>
+              <m:rPr>
+                <m:sty m:val="p"/>
+              </m:rPr>
+              <m:t>c</m:t>
+            </m:r>
+            <m:r>
+              <m:rPr>
+                <m:sty m:val="p"/>
+              </m:rPr>
+              <m:t>t</m:t>
+            </m:r>
+            <m:r>
+              <m:rPr>
+                <m:sty m:val="p"/>
+              </m:rPr>
+              <m:t>r</m:t>
+            </m:r>
+            <m:r>
+              <m:rPr>
+                <m:sty m:val="p"/>
+              </m:rPr>
+              <m:t>l</m:t>
+            </m:r>
+          </m:sub>
+        </m:sSub>
+        <m:r>
+          <m:rPr>
+            <m:sty m:val="p"/>
+          </m:rPr>
+          <m:t>=</m:t>
+        </m:r>
+        <m:sSup>
+          <m:e>
+            <m:r>
+              <m:t>10</m:t>
+            </m:r>
+          </m:e>
+          <m:sup>
+            <m:r>
+              <m:t>13</m:t>
+            </m:r>
+          </m:sup>
+        </m:sSup>
+        <m:sSub>
+          <m:e>
+            <m:r>
+              <m:t>I</m:t>
+            </m:r>
+          </m:e>
+          <m:sub>
+            <m:r>
+              <m:t>3</m:t>
+            </m:r>
+          </m:sub>
+        </m:sSub>
+      </m:oMath>
       <w:r>
         <w:rPr>
           <w:rFonts w:hint="eastAsia"/>
@@ -7165,9 +10145,41 @@
               <w:pStyle w:val="Compact"/>
               <w:jc w:val="right"/>
             </w:pPr>
-            <w:r>
-              <w:t xml:space="preserve">$Q_{\rm ctrl}$</w:t>
-            </w:r>
+            <m:oMath>
+              <m:sSub>
+                <m:e>
+                  <m:r>
+                    <m:t>Q</m:t>
+                  </m:r>
+                </m:e>
+                <m:sub>
+                  <m:r>
+                    <m:rPr>
+                      <m:sty m:val="p"/>
+                    </m:rPr>
+                    <m:t>c</m:t>
+                  </m:r>
+                  <m:r>
+                    <m:rPr>
+                      <m:sty m:val="p"/>
+                    </m:rPr>
+                    <m:t>t</m:t>
+                  </m:r>
+                  <m:r>
+                    <m:rPr>
+                      <m:sty m:val="p"/>
+                    </m:rPr>
+                    <m:t>r</m:t>
+                  </m:r>
+                  <m:r>
+                    <m:rPr>
+                      <m:sty m:val="p"/>
+                    </m:rPr>
+                    <m:t>l</m:t>
+                  </m:r>
+                </m:sub>
+              </m:sSub>
+            </m:oMath>
           </w:p>
         </w:tc>
         <w:tc>
@@ -7230,9 +10242,41 @@
               <w:pStyle w:val="Compact"/>
               <w:jc w:val="right"/>
             </w:pPr>
-            <w:r>
-              <w:t xml:space="preserve">$R_{\rm ctrl}$</w:t>
-            </w:r>
+            <m:oMath>
+              <m:sSub>
+                <m:e>
+                  <m:r>
+                    <m:t>R</m:t>
+                  </m:r>
+                </m:e>
+                <m:sub>
+                  <m:r>
+                    <m:rPr>
+                      <m:sty m:val="p"/>
+                    </m:rPr>
+                    <m:t>c</m:t>
+                  </m:r>
+                  <m:r>
+                    <m:rPr>
+                      <m:sty m:val="p"/>
+                    </m:rPr>
+                    <m:t>t</m:t>
+                  </m:r>
+                  <m:r>
+                    <m:rPr>
+                      <m:sty m:val="p"/>
+                    </m:rPr>
+                    <m:t>r</m:t>
+                  </m:r>
+                  <m:r>
+                    <m:rPr>
+                      <m:sty m:val="p"/>
+                    </m:rPr>
+                    <m:t>l</m:t>
+                  </m:r>
+                </m:sub>
+              </m:sSub>
+            </m:oMath>
           </w:p>
         </w:tc>
         <w:tc>
@@ -8259,9 +11303,71 @@
       <w:r>
         <w:t xml:space="preserve"> </w:t>
       </w:r>
-      <w:r>
-        <w:t xml:space="preserve">$R_{\rm ctrl}=10^{13}I_3$</w:t>
-      </w:r>
+      <m:oMath>
+        <m:sSub>
+          <m:e>
+            <m:r>
+              <m:t>R</m:t>
+            </m:r>
+          </m:e>
+          <m:sub>
+            <m:r>
+              <m:rPr>
+                <m:sty m:val="p"/>
+              </m:rPr>
+              <m:t>c</m:t>
+            </m:r>
+            <m:r>
+              <m:rPr>
+                <m:sty m:val="p"/>
+              </m:rPr>
+              <m:t>t</m:t>
+            </m:r>
+            <m:r>
+              <m:rPr>
+                <m:sty m:val="p"/>
+              </m:rPr>
+              <m:t>r</m:t>
+            </m:r>
+            <m:r>
+              <m:rPr>
+                <m:sty m:val="p"/>
+              </m:rPr>
+              <m:t>l</m:t>
+            </m:r>
+          </m:sub>
+        </m:sSub>
+        <m:r>
+          <m:rPr>
+            <m:sty m:val="p"/>
+          </m:rPr>
+          <m:t>=</m:t>
+        </m:r>
+        <m:sSup>
+          <m:e>
+            <m:r>
+              <m:t>10</m:t>
+            </m:r>
+          </m:e>
+          <m:sup>
+            <m:r>
+              <m:t>13</m:t>
+            </m:r>
+          </m:sup>
+        </m:sSup>
+        <m:sSub>
+          <m:e>
+            <m:r>
+              <m:t>I</m:t>
+            </m:r>
+          </m:e>
+          <m:sub>
+            <m:r>
+              <m:t>3</m:t>
+            </m:r>
+          </m:sub>
+        </m:sSub>
+      </m:oMath>
       <w:r>
         <w:t xml:space="preserve"> </w:t>
       </w:r>
@@ -8625,9 +11731,35 @@
       <w:r>
         <w:t xml:space="preserve"> </w:t>
       </w:r>
-      <w:r>
-        <w:t xml:space="preserve">$A_{\rm SDC}$</w:t>
-      </w:r>
+      <m:oMath>
+        <m:sSub>
+          <m:e>
+            <m:r>
+              <m:t>A</m:t>
+            </m:r>
+          </m:e>
+          <m:sub>
+            <m:r>
+              <m:rPr>
+                <m:sty m:val="p"/>
+              </m:rPr>
+              <m:t>S</m:t>
+            </m:r>
+            <m:r>
+              <m:rPr>
+                <m:sty m:val="p"/>
+              </m:rPr>
+              <m:t>D</m:t>
+            </m:r>
+            <m:r>
+              <m:rPr>
+                <m:sty m:val="p"/>
+              </m:rPr>
+              <m:t>C</m:t>
+            </m:r>
+          </m:sub>
+        </m:sSub>
+      </m:oMath>
       <w:r>
         <w:rPr>
           <w:rFonts w:hint="eastAsia"/>
@@ -8785,9 +11917,80 @@
       <w:r>
         <w:t xml:space="preserve"> </w:t>
       </w:r>
-      <w:r>
-        <w:t xml:space="preserve">$Q_{\rm ctrl},R_{\rm ctrl}$</w:t>
-      </w:r>
+      <m:oMath>
+        <m:sSub>
+          <m:e>
+            <m:r>
+              <m:t>Q</m:t>
+            </m:r>
+          </m:e>
+          <m:sub>
+            <m:r>
+              <m:rPr>
+                <m:sty m:val="p"/>
+              </m:rPr>
+              <m:t>c</m:t>
+            </m:r>
+            <m:r>
+              <m:rPr>
+                <m:sty m:val="p"/>
+              </m:rPr>
+              <m:t>t</m:t>
+            </m:r>
+            <m:r>
+              <m:rPr>
+                <m:sty m:val="p"/>
+              </m:rPr>
+              <m:t>r</m:t>
+            </m:r>
+            <m:r>
+              <m:rPr>
+                <m:sty m:val="p"/>
+              </m:rPr>
+              <m:t>l</m:t>
+            </m:r>
+          </m:sub>
+        </m:sSub>
+        <m:r>
+          <m:rPr>
+            <m:sty m:val="p"/>
+          </m:rPr>
+          <m:t>,</m:t>
+        </m:r>
+        <m:sSub>
+          <m:e>
+            <m:r>
+              <m:t>R</m:t>
+            </m:r>
+          </m:e>
+          <m:sub>
+            <m:r>
+              <m:rPr>
+                <m:sty m:val="p"/>
+              </m:rPr>
+              <m:t>c</m:t>
+            </m:r>
+            <m:r>
+              <m:rPr>
+                <m:sty m:val="p"/>
+              </m:rPr>
+              <m:t>t</m:t>
+            </m:r>
+            <m:r>
+              <m:rPr>
+                <m:sty m:val="p"/>
+              </m:rPr>
+              <m:t>r</m:t>
+            </m:r>
+            <m:r>
+              <m:rPr>
+                <m:sty m:val="p"/>
+              </m:rPr>
+              <m:t>l</m:t>
+            </m:r>
+          </m:sub>
+        </m:sSub>
+      </m:oMath>
       <w:r>
         <w:t xml:space="preserve"> </w:t>
       </w:r>
@@ -8990,9 +12193,73 @@
       <w:r>
         <w:t xml:space="preserve"> </w:t>
       </w:r>
-      <w:r>
-        <w:t xml:space="preserve">$A_{\rm SDC}(\hat{x}_{k|k})$</w:t>
-      </w:r>
+      <m:oMath>
+        <m:sSub>
+          <m:e>
+            <m:r>
+              <m:t>A</m:t>
+            </m:r>
+          </m:e>
+          <m:sub>
+            <m:r>
+              <m:rPr>
+                <m:sty m:val="p"/>
+              </m:rPr>
+              <m:t>S</m:t>
+            </m:r>
+            <m:r>
+              <m:rPr>
+                <m:sty m:val="p"/>
+              </m:rPr>
+              <m:t>D</m:t>
+            </m:r>
+            <m:r>
+              <m:rPr>
+                <m:sty m:val="p"/>
+              </m:rPr>
+              <m:t>C</m:t>
+            </m:r>
+          </m:sub>
+        </m:sSub>
+        <m:d>
+          <m:dPr>
+            <m:begChr m:val="("/>
+            <m:endChr m:val=")"/>
+            <m:sepChr m:val=""/>
+            <m:grow/>
+          </m:dPr>
+          <m:e>
+            <m:sSub>
+              <m:e>
+                <m:acc>
+                  <m:accPr>
+                    <m:chr m:val="̂"/>
+                  </m:accPr>
+                  <m:e>
+                    <m:r>
+                      <m:t>x</m:t>
+                    </m:r>
+                  </m:e>
+                </m:acc>
+              </m:e>
+              <m:sub>
+                <m:r>
+                  <m:t>k</m:t>
+                </m:r>
+                <m:r>
+                  <m:rPr>
+                    <m:sty m:val="p"/>
+                  </m:rPr>
+                  <m:t>|</m:t>
+                </m:r>
+                <m:r>
+                  <m:t>k</m:t>
+                </m:r>
+              </m:sub>
+            </m:sSub>
+          </m:e>
+        </m:d>
+      </m:oMath>
       <w:r>
         <w:t xml:space="preserve"> </w:t>
       </w:r>
@@ -9321,9 +12588,41 @@
       <w:r>
         <w:t xml:space="preserve"> </w:t>
       </w:r>
-      <w:r>
-        <w:t xml:space="preserve">$Q_{\rm ctrl}$</w:t>
-      </w:r>
+      <m:oMath>
+        <m:sSub>
+          <m:e>
+            <m:r>
+              <m:t>Q</m:t>
+            </m:r>
+          </m:e>
+          <m:sub>
+            <m:r>
+              <m:rPr>
+                <m:sty m:val="p"/>
+              </m:rPr>
+              <m:t>c</m:t>
+            </m:r>
+            <m:r>
+              <m:rPr>
+                <m:sty m:val="p"/>
+              </m:rPr>
+              <m:t>t</m:t>
+            </m:r>
+            <m:r>
+              <m:rPr>
+                <m:sty m:val="p"/>
+              </m:rPr>
+              <m:t>r</m:t>
+            </m:r>
+            <m:r>
+              <m:rPr>
+                <m:sty m:val="p"/>
+              </m:rPr>
+              <m:t>l</m:t>
+            </m:r>
+          </m:sub>
+        </m:sSub>
+      </m:oMath>
       <w:r>
         <w:t xml:space="preserve"> </w:t>
       </w:r>
@@ -9336,9 +12635,41 @@
       <w:r>
         <w:t xml:space="preserve"> </w:t>
       </w:r>
-      <w:r>
-        <w:t xml:space="preserve">$R_{\rm ctrl}$</w:t>
-      </w:r>
+      <m:oMath>
+        <m:sSub>
+          <m:e>
+            <m:r>
+              <m:t>R</m:t>
+            </m:r>
+          </m:e>
+          <m:sub>
+            <m:r>
+              <m:rPr>
+                <m:sty m:val="p"/>
+              </m:rPr>
+              <m:t>c</m:t>
+            </m:r>
+            <m:r>
+              <m:rPr>
+                <m:sty m:val="p"/>
+              </m:rPr>
+              <m:t>t</m:t>
+            </m:r>
+            <m:r>
+              <m:rPr>
+                <m:sty m:val="p"/>
+              </m:rPr>
+              <m:t>r</m:t>
+            </m:r>
+            <m:r>
+              <m:rPr>
+                <m:sty m:val="p"/>
+              </m:rPr>
+              <m:t>l</m:t>
+            </m:r>
+          </m:sub>
+        </m:sSub>
+      </m:oMath>
       <w:r>
         <w:rPr>
           <w:rFonts w:hint="eastAsia"/>
@@ -9393,9 +12724,35 @@
       <w:r>
         <w:t xml:space="preserve"> </w:t>
       </w:r>
-      <w:r>
-        <w:t xml:space="preserve">$A_{\rm SDC}$</w:t>
-      </w:r>
+      <m:oMath>
+        <m:sSub>
+          <m:e>
+            <m:r>
+              <m:t>A</m:t>
+            </m:r>
+          </m:e>
+          <m:sub>
+            <m:r>
+              <m:rPr>
+                <m:sty m:val="p"/>
+              </m:rPr>
+              <m:t>S</m:t>
+            </m:r>
+            <m:r>
+              <m:rPr>
+                <m:sty m:val="p"/>
+              </m:rPr>
+              <m:t>D</m:t>
+            </m:r>
+            <m:r>
+              <m:rPr>
+                <m:sty m:val="p"/>
+              </m:rPr>
+              <m:t>C</m:t>
+            </m:r>
+          </m:sub>
+        </m:sSub>
+      </m:oMath>
       <w:r>
         <w:t xml:space="preserve"> </w:t>
       </w:r>
@@ -10116,7 +13473,10 @@
       </w:r>
     </w:p>
     <w:bookmarkEnd w:id="78"/>
-    <w:sectPr/>
+    <w:sectPr>
+      <w:pgSz w:w="11906" w:h="16838"/>
+      <w:pgMar w:top="1417" w:right="1417" w:bottom="1417" w:left="1417" w:header="720" w:footer="720" w:gutter="0"/>
+    </w:sectPr>
   </w:body>
 </w:document>
 </file>

</xml_diff>